<commit_message>
docs: add preface, streamline terminology, and fix Thai line breaking
</commit_message>
<xml_diff>
--- a/docs/01_Reports/G21_Disney_Lorcana_PlayLab_Cloud_Phase2_Report.docx
+++ b/docs/01_Reports/G21_Disney_Lorcana_PlayLab_Cloud_Phase2_Report.docx
@@ -84,7 +84,7 @@
           <w:color w:val="000000"/>
           <w:sz w:val="30"/>
         </w:rPr>
-        <w:t>(Disney Lorcana PlayLab Cloud: Real-Time Multi-AZ IaaS &amp; Serverless Simulator)</w:t>
+        <w:t>Disney Lorcana PlayLab Cloud: Real-Time Multi-AZ IaaS &amp; Serverless Simulator</w:t>
       </w:r>
     </w:p>
     <w:p>
@@ -602,7 +602,7 @@
           <w:color w:val="000000"/>
           <w:sz w:val="40"/>
         </w:rPr>
-        <w:t>บทคัดย่อภาษาไทย</w:t>
+        <w:t>คำนำ</w:t>
       </w:r>
     </w:p>
     <w:p>
@@ -618,7 +618,7 @@
           <w:color w:val="000000"/>
           <w:sz w:val="32"/>
         </w:rPr>
-        <w:t>โครงงาน Disney Lorcana PlayLab Cloud นำเสนอการวิเคราะห์ ออกแบบ และพัฒนาระบบจำลองห้องเล่นและวิเคราะห์เด็คการ์ดแบบเรียลไทม์บนสถาปัตยกรรมคลาวด์แบบผสมผสาน ที่มี Primary IaaS Stack (Custom Lean Multi-AZ VPC ครอบคลุม us-east-1a และ us-east-1b, Application Load Balancer, EC2 Auto Scaling Group, Multi-stage Docker Container) ควบคู่กับ Secondary Serverless Fallback Mode (AWS Lambda, Amazon DynamoDB, AWS API Gateway) เพื่อจำลองและรองรับโหลดการเล่นการ์ดสะสมเชิงกลยุทธ์ Disney Lorcana TCG ได้อย่างเสถียรและไร้รอยต่อ มีความหน่วงในการตอบสนองต่ำกว่า 100 มิลลิวินาที พร้อมกลไก Fault Tolerance และการปรับขนาดอัตโนมัติ (Target Tracking CPU &gt; 60%) ภายใต้งบประมาณจำกัด $50 ของ AWS Academy Learner Lab อย่างมีประสิทธิภาพสูงสุด</w:t>
+        <w:t>เทคโนโลยีกลุ่มเมฆ (Cloud Computing) มีบทบาทสำคัญอย่างยิ่งในการพัฒนาระบบสารสนเทศและแอปพลิเคชันยุคใหม่ ด้วยคุณสมบัติเด่นด้านความยืดหยุ่น ความพร้อมใช้งานสูง และความสามารถในการปรับขนาดทรัพยากรได้ตามความต้องการใช้งานจริง โดยไม่ต้องลงทุนในโครงสร้างพื้นฐานฮาร์ดแวร์ล่วงหน้า รายงานฉบับนี้จัดทำขึ้นเพื่อประกอบการเรียนการสอนรายวิชาเทคโนโลยีกลุ่มเมฆ คณะเทคโนโลยีสารสนเทศ สถาบันเทคโนโลยีพระจอมเกล้าเจ้าคุณทหารลาดกระบัง</w:t>
       </w:r>
     </w:p>
     <w:p>
@@ -634,7 +634,7 @@
           <w:color w:val="000000"/>
           <w:sz w:val="32"/>
         </w:rPr>
-        <w:t>ในส่วนของส่วนติดต่อผู้ใช้ Frontend ระบบได้รับการพัฒนาด้วย React 19, TypeScript 5.x, Tailwind CSS v4, Framer Motion และ Zustand เพื่อส่งมอบประสบการณ์การเล่นระดับพรีเมียม ประกอบด้วยระบบจำลองฟิสิกส์ 3 มิติ การตรวจสอบการ์ดแบบ 3D Holographic Foil Inspector, การจำลองเปิดซองการ์ด Booster Pack 12 ใบด้วย Fisher-Yates True Randomization Algorithm, และระบบจัดการเด็คการ์ดที่เชื่อมต่อกับฐานข้อมูลการ์ดอย่างเป็นทางการครบถ้วนกว่า 3,242 ใบ ครอบคลุมตั้งแต่ Set 1 The First Chapter ถึง Set 13 Attack of the Vine!</w:t>
+        <w:t>โครงงาน Disney Lorcana PlayLab Cloud มุ่งเน้นการวิเคราะห์ ออกแบบ และพัฒนาระบบจำลองกระดานเล่นการ์ดและวิเคราะห์เด็คแบบเรียลไทม์บนเว็บแอปพลิเคชัน โดยประยุกต์ใช้บริการคลาวด์บน Amazon Web Services (AWS) ออกแบบสถาปัตยกรรม Lean Multi-AZ VPC ร่วมกับ Application Load Balancer, EC2 Auto Scaling Group, Docker Container, และ Amazon DynamoDB เพื่อสร้างระบบที่มีประสิทธิภาพสูง ตอบสนองได้อย่างรวดเร็ว มี Latency ต่ำกว่า 100 มิลลิวินาที และควบคุมค่าใช้จ่ายให้อยู่ภายใต้งบประมาณจำกัด $50 ของ AWS Academy Learner Lab ได้อย่างมีประสิทธิภาพ</w:t>
       </w:r>
     </w:p>
     <w:p>
@@ -650,13 +650,13 @@
           <w:color w:val="000000"/>
           <w:sz w:val="32"/>
         </w:rPr>
-        <w:t>การดำเนินงานตามระเบียบวิธีปฏิบัติงานแบบ Agile Scrum ได้ลุล่วงตามแผนงาน Sprint 1 ถึง Sprint 3 อย่างสมบูรณ์ 100% ครอบคลุมการสร้าง Core Gameplay UI, ระบบยืนยันตัวตน Custom bcrypt + JWT และจัดการเด็ค, ระบบห้องแข่งขันแบบเรียลไทม์ความเร็วสูง Sub-100ms Action Sync พร้อมระบบ Rejoin Grace Period 60 วินาที และ Voluntary Exit Match, การย้ายโฮสติ้งจาก S3 Static Hosting สู่ Nginx Reverse Proxy และ Container บน EC2, และการพัฒนาสคริปต์ 1-Click Scale-to-Zero lab_start.ps1, lab_stop.ps1 ที่ควบคุมต้นทุน Compute ให้เหลือ $0.00/ชม. เมื่อไม่ได้ใช้งาน พร้อมทั้งตัดต้นทุน NAT Gateway ($32.40/เดือน) เหลือ $0.00 ด้วยการใช้ Chained Security Groups ทำให้ระบบมีความพร้อมอย่างสมบูรณ์สำหรับการประเมินความก้าวหน้า Stage 2</w:t>
+        <w:t>คณะผู้จัดทำหวังเป็นอย่างยิ่งว่า ข้อมูล รายละเอียดสถาปัตยกรรม และผลการทดสอบที่นำเสนอในรายงานความก้าวหน้าฉบับนี้ จะเป็นประโยชน์ต่อการศึกษาและเป็นแนวทางในการพัฒนาระบบคลาวด์สำหรับผู้ที่สนใจ หากรายงานฉบับนี้มีข้อบกพร่องหรือข้อผิดพลาดประการใด คณะผู้จัดทำขอน้อมรับคำชี้แนะเพื่อนำไปปรับปรุงในระยะต่อไป</w:t>
       </w:r>
     </w:p>
     <w:p>
       <w:pPr>
-        <w:spacing w:before="240" w:after="120" w:line="276" w:lineRule="auto"/>
-        <w:jc w:val="left"/>
+        <w:spacing w:before="360" w:after="40" w:line="276" w:lineRule="auto"/>
+        <w:jc w:val="right"/>
       </w:pPr>
       <w:r>
         <w:rPr>
@@ -665,157 +665,7 @@
           <w:color w:val="000000"/>
           <w:sz w:val="32"/>
         </w:rPr>
-        <w:t>คำสำคัญ: Cloud Computing, Multi-AZ VPC, Application Load Balancer, Auto Scaling Group, Docker Containers, WebSockets, Disney Lorcana TCG, AWS Learner Lab, Scale-to-Zero</w:t>
-      </w:r>
-    </w:p>
-    <w:p>
-      <w:r>
-        <w:br w:type="page"/>
-      </w:r>
-    </w:p>
-    <w:p>
-      <w:pPr>
-        <w:spacing w:before="240" w:after="360" w:line="276" w:lineRule="auto"/>
-        <w:jc w:val="center"/>
-      </w:pPr>
-      <w:r>
-        <w:rPr>
-          <w:rFonts w:ascii="TH Sarabun New" w:hAnsi="TH Sarabun New"/>
-          <w:b/>
-          <w:color w:val="000000"/>
-          <w:sz w:val="40"/>
-        </w:rPr>
-        <w:t>Abstract</w:t>
-      </w:r>
-    </w:p>
-    <w:p>
-      <w:pPr>
-        <w:spacing w:before="0" w:after="120" w:line="276" w:lineRule="auto"/>
-        <w:ind w:firstLine="709"/>
-        <w:jc w:val="left"/>
-      </w:pPr>
-      <w:r>
-        <w:rPr>
-          <w:rFonts w:ascii="TH Sarabun New" w:hAnsi="TH Sarabun New"/>
-          <w:b w:val="0"/>
-          <w:color w:val="000000"/>
-          <w:sz w:val="32"/>
-        </w:rPr>
-        <w:t>The Disney Lorcana PlayLab Cloud (Group G21) project presents the architectural design, engineering analysis, and implementation of an advanced real-time multiplayer card game simulator and asynchronous deck analytics platform for the Disney Lorcana Trading Card Game (TCG). The system is built on a resilient Hybrid Cloud Architecture featuring a Primary IaaS Containerized Stack (Custom Lean Multi-AZ VPC across us-east-1a and us-east-1b, Application Load Balancer, EC2 Auto Scaling Group, and Multi-stage Alpine Docker) alongside a Secondary Serverless Fallback Mode (AWS Lambda, Amazon DynamoDB, AWS API Gateway). The system achieves ultra-low synchronization latency (&lt;100ms), automated multi-zone fault tolerance, and dynamic elasticity (Target Tracking CPU Utilization &gt; 60%) within the strict budgetary constraints of the AWS Academy Learner Lab ($50 allocation).</w:t>
-      </w:r>
-    </w:p>
-    <w:p>
-      <w:pPr>
-        <w:spacing w:before="0" w:after="120" w:line="276" w:lineRule="auto"/>
-        <w:ind w:firstLine="709"/>
-        <w:jc w:val="left"/>
-      </w:pPr>
-      <w:r>
-        <w:rPr>
-          <w:rFonts w:ascii="TH Sarabun New" w:hAnsi="TH Sarabun New"/>
-          <w:b w:val="0"/>
-          <w:color w:val="000000"/>
-          <w:sz w:val="32"/>
-        </w:rPr>
-        <w:t>The frontend client is engineered using React 19, TypeScript 5.x, Tailwind CSS v4, Zustand global state orchestration, and Framer Motion, delivering a high-fidelity tabletop simulation connected to an official catalog of 3,242 cards (spanning Set 1 The First Chapter and Set 2 Rise of the Floodborn). Core features include real-time mouse tilt physics, 3D holographic foil card inspection, and a 12-card Booster Pack gacha simulator driven by the Fisher-Yates true randomization algorithm.</w:t>
-      </w:r>
-    </w:p>
-    <w:p>
-      <w:pPr>
-        <w:spacing w:before="0" w:after="120" w:line="276" w:lineRule="auto"/>
-        <w:ind w:firstLine="709"/>
-        <w:jc w:val="left"/>
-      </w:pPr>
-      <w:r>
-        <w:rPr>
-          <w:rFonts w:ascii="TH Sarabun New" w:hAnsi="TH Sarabun New"/>
-          <w:b w:val="0"/>
-          <w:color w:val="000000"/>
-          <w:sz w:val="32"/>
-        </w:rPr>
-        <w:t>Project execution adheres to the Agile Scrum framework, achieving 100% completion across Sprints 1 to 3. Key engineering deliverables include the migration from S3 static hosting to a containerized Nginx reverse proxy on EC2, WebSocket Match Lifecycle v1.5.0 featuring a 60-second Rejoin Grace Period and instant Voluntary Exit Match slot reclamation, chained security group topologies eliminating NAT Gateway expenses ($32.40/month -&gt; $0.00), and 1-Click Scale-to-Zero automation scripts (lab_start.ps1, lab_stop.ps1) ensuring $0.00/hour idle compute expense.</w:t>
-      </w:r>
-    </w:p>
-    <w:p>
-      <w:pPr>
-        <w:spacing w:before="240" w:after="120" w:line="276" w:lineRule="auto"/>
-        <w:jc w:val="left"/>
-      </w:pPr>
-      <w:r>
-        <w:rPr>
-          <w:rFonts w:ascii="TH Sarabun New" w:hAnsi="TH Sarabun New"/>
-          <w:b w:val="0"/>
-          <w:color w:val="000000"/>
-          <w:sz w:val="32"/>
-        </w:rPr>
-        <w:t>Keywords: Cloud Computing, Multi-AZ VPC, Application Load Balancer, Auto Scaling Group, Docker Containers, WebSockets, Digital TCG, AWS Learner Lab, Scale-to-Zero</w:t>
-      </w:r>
-    </w:p>
-    <w:p>
-      <w:r>
-        <w:br w:type="page"/>
-      </w:r>
-    </w:p>
-    <w:p>
-      <w:pPr>
-        <w:spacing w:before="240" w:after="360" w:line="276" w:lineRule="auto"/>
-        <w:jc w:val="center"/>
-      </w:pPr>
-      <w:r>
-        <w:rPr>
-          <w:rFonts w:ascii="TH Sarabun New" w:hAnsi="TH Sarabun New"/>
-          <w:b/>
-          <w:color w:val="000000"/>
-          <w:sz w:val="40"/>
-        </w:rPr>
-        <w:t>กิตติกรรมประกาศ</w:t>
-      </w:r>
-    </w:p>
-    <w:p>
-      <w:pPr>
-        <w:spacing w:before="0" w:after="120" w:line="276" w:lineRule="auto"/>
-        <w:ind w:firstLine="709"/>
-        <w:jc w:val="left"/>
-      </w:pPr>
-      <w:r>
-        <w:rPr>
-          <w:rFonts w:ascii="TH Sarabun New" w:hAnsi="TH Sarabun New"/>
-          <w:b w:val="0"/>
-          <w:color w:val="000000"/>
-          <w:sz w:val="32"/>
-        </w:rPr>
-        <w:t>โครงงาน Disney Lorcana PlayLab Cloud สำเร็จลุล่วงตามวัตถุประสงค์ของการส่งมอบงานในระยะที่ 2 ได้ด้วยความอนุเคราะห์ คำแนะนำ และการชี้แนะทางวิชาการอันทรงคุณค่ายิ่งจากคณาจารย์ประจำรายวิชาการเทคโนโลยีกลุ่มเมฆ คณะเทคโนโลยีสารสนเทศ สถาบันเทคโนโลยีพระจอมเกล้าเจ้าคุณทหารลาดกระบัง ได้แก่ ดร. ธนานพ ทองถาวร, ผศ.ดร. พัฒนพงษ์ ฉันทมิตรโอภาส, และ ผศ.ดร. ลภัส ประดิษฐ์ทัศนีย์ ที่ได้กรุณาถ่ายทอดองค์ความรู้ด้านสถาปัตยกรรมคลาวด์ การออกแบบระบบเครือข่าย Multi-AZ VPC ความปลอดภัย และการบริหารจัดการทรัพยากรอย่างคุ้มค่า ซึ่งเป็นรากฐานสำคัญในการออกแบบและแก้ปัญหาทางวิศวกรรมซอฟต์แวร์ในโครงงานนี้</w:t>
-      </w:r>
-    </w:p>
-    <w:p>
-      <w:pPr>
-        <w:spacing w:before="0" w:after="120" w:line="276" w:lineRule="auto"/>
-        <w:ind w:firstLine="709"/>
-        <w:jc w:val="left"/>
-      </w:pPr>
-      <w:r>
-        <w:rPr>
-          <w:rFonts w:ascii="TH Sarabun New" w:hAnsi="TH Sarabun New"/>
-          <w:b w:val="0"/>
-          <w:color w:val="000000"/>
-          <w:sz w:val="32"/>
-        </w:rPr>
-        <w:t>คณะผู้จัดทำขอขอบพระคุณเพื่อน ๆ นักศึกษาคณะเทคโนโลยีสารสนเทศ ทุกท่านที่ได้ร่วมทดสอบระบบกระดานและห้องเล่นแบบเรียลไทม์ ให้ข้อคิดเห็นด้านประสบการณ์การใช้งาน และร่วมตรวจสอบข้อผิดพลาดของระบบ รวมถึงขอขอบคุณครอบครัวที่ให้การสนับสนุนและเป็นกำลังใจในการศึกษาค้นคว้าตลอดมา</w:t>
-      </w:r>
-    </w:p>
-    <w:p>
-      <w:pPr>
-        <w:spacing w:before="360" w:after="40" w:line="276" w:lineRule="auto"/>
-        <w:jc w:val="right"/>
-      </w:pPr>
-      <w:r>
-        <w:rPr>
-          <w:rFonts w:ascii="TH Sarabun New" w:hAnsi="TH Sarabun New"/>
-          <w:b w:val="0"/>
-          <w:color w:val="000000"/>
-          <w:sz w:val="32"/>
-        </w:rPr>
-        <w:t>คณะผู้จัดทำ Disney Lorcana PlayLab</w:t>
+        <w:t>คณะผู้จัดทำ</w:t>
       </w:r>
     </w:p>
     <w:p>
@@ -840,6 +690,254 @@
     </w:p>
     <w:p>
       <w:pPr>
+        <w:spacing w:before="240" w:after="360" w:line="276" w:lineRule="auto"/>
+        <w:jc w:val="center"/>
+      </w:pPr>
+      <w:r>
+        <w:rPr>
+          <w:rFonts w:ascii="TH Sarabun New" w:hAnsi="TH Sarabun New"/>
+          <w:b/>
+          <w:color w:val="000000"/>
+          <w:sz w:val="40"/>
+        </w:rPr>
+        <w:t>บทคัดย่อภาษาไทย</w:t>
+      </w:r>
+    </w:p>
+    <w:p>
+      <w:pPr>
+        <w:spacing w:before="0" w:after="120" w:line="276" w:lineRule="auto"/>
+        <w:ind w:firstLine="709"/>
+        <w:jc w:val="left"/>
+      </w:pPr>
+      <w:r>
+        <w:rPr>
+          <w:rFonts w:ascii="TH Sarabun New" w:hAnsi="TH Sarabun New"/>
+          <w:b w:val="0"/>
+          <w:color w:val="000000"/>
+          <w:sz w:val="32"/>
+        </w:rPr>
+        <w:t>โครงงาน Disney Lorcana PlayLab Cloud นำเสนอการวิเคราะห์ ออกแบบ และพัฒนาระบบจำลองห้องเล่นและวิเคราะห์เด็คการ์ดแบบเรียลไทม์บนสถาปัตยกรรม Hybrid Cloud ที่มี Primary IaaS Stack บน Custom Lean Multi-AZ VPC ครอบคลุม Availability Zone us-east-1a และ us-east-1b, Application Load Balancer, EC2 Auto Scaling Group และ Multi-stage Docker Container ควบคู่กับ Secondary Serverless Stack บน AWS Lambda, Amazon DynamoDB และ AWS API Gateway เพื่อรองรับการเล่นการ์ดสะสม Disney Lorcana TCG ได้อย่างเสถียรและต่อเนื่อง มีความหน่วงในการตอบสนองต่ำกว่า 100 มิลลิวินาที พร้อมกลไก Fault Tolerance และการปรับขนาดอัตโนมัติเมื่อ CPU เฉลี่ยสูงกว่า 60% ภายใต้งบประมาณจำกัด $50 ของ AWS Academy Learner Lab</w:t>
+      </w:r>
+    </w:p>
+    <w:p>
+      <w:pPr>
+        <w:spacing w:before="0" w:after="120" w:line="276" w:lineRule="auto"/>
+        <w:ind w:firstLine="709"/>
+        <w:jc w:val="left"/>
+      </w:pPr>
+      <w:r>
+        <w:rPr>
+          <w:rFonts w:ascii="TH Sarabun New" w:hAnsi="TH Sarabun New"/>
+          <w:b w:val="0"/>
+          <w:color w:val="000000"/>
+          <w:sz w:val="32"/>
+        </w:rPr>
+        <w:t>ในส่วนของส่วนติดต่อผู้ใช้ Frontend พัฒนาด้วย React 19, TypeScript 5.x, Tailwind CSS v4, Framer Motion และ Zustand เพื่อส่งมอบประสบการณ์การเล่นระดับพรีเมียม ประกอบด้วยระบบจำลองฟิสิกส์ 3 มิติ, ระบบตรวจสอบการ์ด 3D Holographic Foil Inspector, การจำลองเปิดซองการ์ด Booster Pack 12 ใบด้วยอัลกอริทึม Fisher-Yates True Randomization, และระบบจัดการเด็คการ์ดที่เชื่อมต่อกับฐานข้อมูลการ์ดอย่างเป็นทางการครบถ้วน 3,242 ใบ ครอบคลุมตั้งแต่ชุด The First Chapter จนถึง Attack of the Vine</w:t>
+      </w:r>
+    </w:p>
+    <w:p>
+      <w:pPr>
+        <w:spacing w:before="0" w:after="120" w:line="276" w:lineRule="auto"/>
+        <w:ind w:firstLine="709"/>
+        <w:jc w:val="left"/>
+      </w:pPr>
+      <w:r>
+        <w:rPr>
+          <w:rFonts w:ascii="TH Sarabun New" w:hAnsi="TH Sarabun New"/>
+          <w:b w:val="0"/>
+          <w:color w:val="000000"/>
+          <w:sz w:val="32"/>
+        </w:rPr>
+        <w:t>การดำเนินงานตามระเบียบวิธี Agile Scrum ได้ลุล่วงตามแผนงาน Sprint 1 ถึง Sprint 3 ครบถ้วน 100% ครอบคลุมการสร้าง Core Gameplay UI, ระบบยืนยันตัวตนด้วย bcrypt และ JWT, ระบบห้องแข่งขันแบบเรียลไทม์ Sub-100ms Action Sync พร้อมระบบ Rejoin Grace Period 60 วินาที และ Voluntary Exit Match, การย้ายระบบสู่ Nginx Reverse Proxy และ Container บน EC2, ตลอดจนการพัฒนาสคริปต์ 1-Click Scale-to-Zero เพื่อควบคุมต้นทุน Compute ให้เหลือ $0.00 ต่อชั่วโมงเมื่อไม่ได้ใช้งาน และตัดต้นทุน NAT Gateway เหลือ $0.00 ด้วยการใช้ Chained Security Groups ส่งผลให้ระบบมีความพร้อมอย่างสมบูรณ์สำหรับการประเมินความก้าวหน้า Stage 2</w:t>
+      </w:r>
+    </w:p>
+    <w:p>
+      <w:pPr>
+        <w:spacing w:before="240" w:after="120" w:line="276" w:lineRule="auto"/>
+        <w:jc w:val="left"/>
+      </w:pPr>
+      <w:r>
+        <w:rPr>
+          <w:rFonts w:ascii="TH Sarabun New" w:hAnsi="TH Sarabun New"/>
+          <w:b w:val="0"/>
+          <w:color w:val="000000"/>
+          <w:sz w:val="32"/>
+        </w:rPr>
+        <w:t>คำสำคัญ: Cloud Computing, Multi-AZ VPC, Application Load Balancer, Auto Scaling Group, Docker Container, WebSockets, Disney Lorcana TCG, AWS Learner Lab, Scale-to-Zero</w:t>
+      </w:r>
+    </w:p>
+    <w:p>
+      <w:r>
+        <w:br w:type="page"/>
+      </w:r>
+    </w:p>
+    <w:p>
+      <w:pPr>
+        <w:spacing w:before="240" w:after="360" w:line="276" w:lineRule="auto"/>
+        <w:jc w:val="center"/>
+      </w:pPr>
+      <w:r>
+        <w:rPr>
+          <w:rFonts w:ascii="TH Sarabun New" w:hAnsi="TH Sarabun New"/>
+          <w:b/>
+          <w:color w:val="000000"/>
+          <w:sz w:val="40"/>
+        </w:rPr>
+        <w:t>Abstract</w:t>
+      </w:r>
+    </w:p>
+    <w:p>
+      <w:pPr>
+        <w:spacing w:before="0" w:after="120" w:line="276" w:lineRule="auto"/>
+        <w:ind w:firstLine="709"/>
+        <w:jc w:val="left"/>
+      </w:pPr>
+      <w:r>
+        <w:rPr>
+          <w:rFonts w:ascii="TH Sarabun New" w:hAnsi="TH Sarabun New"/>
+          <w:b w:val="0"/>
+          <w:color w:val="000000"/>
+          <w:sz w:val="32"/>
+        </w:rPr>
+        <w:t>The Disney Lorcana PlayLab Cloud project presents the architectural design, engineering analysis, and implementation of a real-time multiplayer tabletop simulator and deck analytics platform for the Disney Lorcana Trading Card Game (TCG). The platform is built on a resilient Hybrid Cloud Architecture featuring a Primary IaaS Containerized Stack (Custom Lean Multi-AZ VPC across us-east-1a and us-east-1b, Application Load Balancer, EC2 Auto Scaling Group, and Multi-stage Alpine Docker) alongside a Secondary Serverless Stack (AWS Lambda, Amazon DynamoDB, AWS API Gateway). The system achieves ultra-low synchronization latency (&lt;100ms), automated multi-zone fault tolerance, and dynamic elasticity (Target Tracking CPU Utilization &gt; 60%) within the strict budgetary constraints of the AWS Academy Learner Lab ($50 allocation).</w:t>
+      </w:r>
+    </w:p>
+    <w:p>
+      <w:pPr>
+        <w:spacing w:before="0" w:after="120" w:line="276" w:lineRule="auto"/>
+        <w:ind w:firstLine="709"/>
+        <w:jc w:val="left"/>
+      </w:pPr>
+      <w:r>
+        <w:rPr>
+          <w:rFonts w:ascii="TH Sarabun New" w:hAnsi="TH Sarabun New"/>
+          <w:b w:val="0"/>
+          <w:color w:val="000000"/>
+          <w:sz w:val="32"/>
+        </w:rPr>
+        <w:t>The frontend client is engineered using React 19, TypeScript 5.x, Tailwind CSS v4, Zustand global state orchestration, and Framer Motion, delivering a high-fidelity tabletop simulation connected to an official catalog of 3,242 cards. Core capabilities include real-time mouse tilt physics, 3D holographic foil inspection, and a 12-card Booster Pack simulator driven by the Fisher-Yates randomization algorithm.</w:t>
+      </w:r>
+    </w:p>
+    <w:p>
+      <w:pPr>
+        <w:spacing w:before="0" w:after="120" w:line="276" w:lineRule="auto"/>
+        <w:ind w:firstLine="709"/>
+        <w:jc w:val="left"/>
+      </w:pPr>
+      <w:r>
+        <w:rPr>
+          <w:rFonts w:ascii="TH Sarabun New" w:hAnsi="TH Sarabun New"/>
+          <w:b w:val="0"/>
+          <w:color w:val="000000"/>
+          <w:sz w:val="32"/>
+        </w:rPr>
+        <w:t>Project execution adheres to the Agile Scrum framework, achieving 100% completion across Sprints 1 to 3. Key deliverables include the containerized Nginx reverse proxy on EC2, WebSocket Match Lifecycle v1.5.0 featuring a 60-second Rejoin Grace Period and instant Voluntary Exit Match slot reclamation, chained security group topologies eliminating NAT Gateway costs ($32.40/month to $0.00), and 1-Click Scale-to-Zero automation scripts ensuring zero idle compute expense.</w:t>
+      </w:r>
+    </w:p>
+    <w:p>
+      <w:pPr>
+        <w:spacing w:before="240" w:after="120" w:line="276" w:lineRule="auto"/>
+        <w:jc w:val="left"/>
+      </w:pPr>
+      <w:r>
+        <w:rPr>
+          <w:rFonts w:ascii="TH Sarabun New" w:hAnsi="TH Sarabun New"/>
+          <w:b w:val="0"/>
+          <w:color w:val="000000"/>
+          <w:sz w:val="32"/>
+        </w:rPr>
+        <w:t>Keywords: Cloud Computing, Multi-AZ VPC, Application Load Balancer, Auto Scaling Group, Docker Containers, WebSockets, Disney Lorcana TCG, AWS Learner Lab, Scale-to-Zero</w:t>
+      </w:r>
+    </w:p>
+    <w:p>
+      <w:r>
+        <w:br w:type="page"/>
+      </w:r>
+    </w:p>
+    <w:p>
+      <w:pPr>
+        <w:spacing w:before="240" w:after="360" w:line="276" w:lineRule="auto"/>
+        <w:jc w:val="center"/>
+      </w:pPr>
+      <w:r>
+        <w:rPr>
+          <w:rFonts w:ascii="TH Sarabun New" w:hAnsi="TH Sarabun New"/>
+          <w:b/>
+          <w:color w:val="000000"/>
+          <w:sz w:val="40"/>
+        </w:rPr>
+        <w:t>กิตติกรรมประกาศ</w:t>
+      </w:r>
+    </w:p>
+    <w:p>
+      <w:pPr>
+        <w:spacing w:before="0" w:after="120" w:line="276" w:lineRule="auto"/>
+        <w:ind w:firstLine="709"/>
+        <w:jc w:val="left"/>
+      </w:pPr>
+      <w:r>
+        <w:rPr>
+          <w:rFonts w:ascii="TH Sarabun New" w:hAnsi="TH Sarabun New"/>
+          <w:b w:val="0"/>
+          <w:color w:val="000000"/>
+          <w:sz w:val="32"/>
+        </w:rPr>
+        <w:t>โครงงาน Disney Lorcana PlayLab Cloud สำเร็จลุล่วงตามวัตถุประสงค์ของการส่งมอบงานในระยะที่ 2 ได้ด้วยความอนุเคราะห์ คำแนะนำ และการชี้แนะทางวิชาการอันทรงคุณค่ายิ่งจากคณาจารย์ประจำรายวิชาเทคโนโลยีกลุ่มเมฆ คณะเทคโนโลยีสารสนเทศ สถาบันเทคโนโลยีพระจอมเกล้าเจ้าคุณทหารลาดกระบัง ได้แก่ ดร. ธนานพ ทองถาวร, ผศ.ดร. พัฒนพงษ์ ฉันทมิตรโอภาส, และ ผศ.ดร. ลภัส ประดิษฐ์ทัศนีย์ ที่ได้กรุณาถ่ายทอดองค์ความรู้ด้านสถาปัตยกรรมคลาวด์ การออกแบบระบบเครือข่าย Multi-AZ VPC ความปลอดภัย และการบริหารจัดการทรัพยากรอย่างคุ้มค่า ซึ่งเป็นรากฐานสำคัญในการออกแบบและแก้ปัญหาทางวิศวกรรมซอฟต์แวร์ในโครงงานนี้</w:t>
+      </w:r>
+    </w:p>
+    <w:p>
+      <w:pPr>
+        <w:spacing w:before="0" w:after="120" w:line="276" w:lineRule="auto"/>
+        <w:ind w:firstLine="709"/>
+        <w:jc w:val="left"/>
+      </w:pPr>
+      <w:r>
+        <w:rPr>
+          <w:rFonts w:ascii="TH Sarabun New" w:hAnsi="TH Sarabun New"/>
+          <w:b w:val="0"/>
+          <w:color w:val="000000"/>
+          <w:sz w:val="32"/>
+        </w:rPr>
+        <w:t>คณะผู้จัดทำขอขอบพระคุณเพื่อน ๆ นักศึกษาคณะเทคโนโลยีสารสนเทศ ทุกท่านที่ได้ร่วมทดสอบระบบกระดานและห้องเล่นแบบเรียลไทม์ ให้ข้อคิดเห็นด้านประสบการณ์การใช้งาน และร่วมตรวจสอบข้อผิดพลาดของระบบ รวมถึงขอขอบคุณครอบครัวที่ให้การสนับสนุนและเป็นกำลังใจในการศึกษาค้นคว้าตลอดมา</w:t>
+      </w:r>
+    </w:p>
+    <w:p>
+      <w:pPr>
+        <w:spacing w:before="360" w:after="40" w:line="276" w:lineRule="auto"/>
+        <w:jc w:val="right"/>
+      </w:pPr>
+      <w:r>
+        <w:rPr>
+          <w:rFonts w:ascii="TH Sarabun New" w:hAnsi="TH Sarabun New"/>
+          <w:b w:val="0"/>
+          <w:color w:val="000000"/>
+          <w:sz w:val="32"/>
+        </w:rPr>
+        <w:t>คณะผู้จัดทำ</w:t>
+      </w:r>
+    </w:p>
+    <w:p>
+      <w:pPr>
+        <w:spacing w:before="0" w:after="0" w:line="276" w:lineRule="auto"/>
+        <w:jc w:val="right"/>
+      </w:pPr>
+      <w:r>
+        <w:rPr>
+          <w:rFonts w:ascii="TH Sarabun New" w:hAnsi="TH Sarabun New"/>
+          <w:b w:val="0"/>
+          <w:color w:val="000000"/>
+          <w:sz w:val="32"/>
+        </w:rPr>
+        <w:t>กันยายน 2569</w:t>
+      </w:r>
+    </w:p>
+    <w:p>
+      <w:r>
+        <w:br w:type="page"/>
+      </w:r>
+    </w:p>
+    <w:p>
+      <w:pPr>
         <w:spacing w:before="240" w:after="80" w:line="276" w:lineRule="auto"/>
         <w:jc w:val="center"/>
       </w:pPr>
@@ -866,6 +964,32 @@
           <w:sz w:val="32"/>
         </w:rPr>
         <w:t>หน้า</w:t>
+      </w:r>
+    </w:p>
+    <w:p>
+      <w:pPr>
+        <w:tabs>
+          <w:tab w:pos="8504" w:val="right" w:leader="dot"/>
+        </w:tabs>
+        <w:spacing w:before="0" w:after="60" w:line="276" w:lineRule="auto"/>
+        <w:jc w:val="left"/>
+      </w:pPr>
+      <w:r>
+        <w:rPr>
+          <w:rFonts w:ascii="TH Sarabun New" w:hAnsi="TH Sarabun New"/>
+          <w:b w:val="0"/>
+          <w:sz w:val="32"/>
+        </w:rPr>
+        <w:t>คำนำ</w:t>
+      </w:r>
+      <w:r>
+        <w:rPr>
+          <w:rFonts w:ascii="TH Sarabun New" w:hAnsi="TH Sarabun New"/>
+          <w:b w:val="0"/>
+          <w:sz w:val="32"/>
+        </w:rPr>
+        <w:tab/>
+        <w:t>ก</w:t>
       </w:r>
     </w:p>
     <w:p>
@@ -891,7 +1015,7 @@
           <w:sz w:val="32"/>
         </w:rPr>
         <w:tab/>
-        <w:t>ก</w:t>
+        <w:t>ข</w:t>
       </w:r>
     </w:p>
     <w:p>
@@ -917,7 +1041,7 @@
           <w:sz w:val="32"/>
         </w:rPr>
         <w:tab/>
-        <w:t>ข</w:t>
+        <w:t>ค</w:t>
       </w:r>
     </w:p>
     <w:p>
@@ -943,7 +1067,7 @@
           <w:sz w:val="32"/>
         </w:rPr>
         <w:tab/>
-        <w:t>ค</w:t>
+        <w:t>ง</w:t>
       </w:r>
     </w:p>
     <w:p>
@@ -969,7 +1093,7 @@
           <w:sz w:val="32"/>
         </w:rPr>
         <w:tab/>
-        <w:t>ง</w:t>
+        <w:t>จ</w:t>
       </w:r>
     </w:p>
     <w:p>
@@ -995,7 +1119,7 @@
           <w:sz w:val="32"/>
         </w:rPr>
         <w:tab/>
-        <w:t>จ</w:t>
+        <w:t>ฉ</w:t>
       </w:r>
     </w:p>
     <w:p>
@@ -1021,7 +1145,7 @@
           <w:sz w:val="32"/>
         </w:rPr>
         <w:tab/>
-        <w:t>ฉ</w:t>
+        <w:t>ช</w:t>
       </w:r>
     </w:p>
     <w:p>
@@ -1038,7 +1162,7 @@
           <w:b/>
           <w:sz w:val="32"/>
         </w:rPr>
-        <w:t>บทที่ 1 บทนำ (Introduction)</w:t>
+        <w:t>บทที่ 1 บทนำ</w:t>
       </w:r>
       <w:r>
         <w:rPr>
@@ -1119,7 +1243,7 @@
           <w:b w:val="0"/>
           <w:sz w:val="32"/>
         </w:rPr>
-        <w:t>1.3 ขอบเขตของระบบ (System Scope)</w:t>
+        <w:t>1.3 ขอบเขตของระบบ</w:t>
       </w:r>
       <w:r>
         <w:rPr>
@@ -1199,7 +1323,7 @@
           <w:b/>
           <w:sz w:val="32"/>
         </w:rPr>
-        <w:t>บทที่ 2 การบริหารจัดการโครงการและเครื่องมือที่ใช้ (Project Management &amp; Tech Stack)</w:t>
+        <w:t>บทที่ 2 การบริหารจัดการโครงการและเทคโนโลยีที่ใช้</w:t>
       </w:r>
       <w:r>
         <w:rPr>
@@ -1226,7 +1350,7 @@
           <w:b w:val="0"/>
           <w:sz w:val="32"/>
         </w:rPr>
-        <w:t>2.1 ระเบียบวิธีปฏิบัติงานแบบ Agile Scrum และแผนการพัฒนา</w:t>
+        <w:t>2.1 แผนการพัฒนาและระเบียบวิธี Agile Scrum</w:t>
       </w:r>
       <w:r>
         <w:rPr>
@@ -1253,7 +1377,7 @@
           <w:b w:val="0"/>
           <w:sz w:val="32"/>
         </w:rPr>
-        <w:t>2.2 สรุปผลความก้าวหน้าการดำเนินงาน Sprint 1 ถึง Sprint 3</w:t>
+        <w:t>2.2 สรุปผลความก้าวหน้า Sprint 1 ถึง Sprint 3</w:t>
       </w:r>
       <w:r>
         <w:rPr>
@@ -1280,7 +1404,7 @@
           <w:b w:val="0"/>
           <w:sz w:val="32"/>
         </w:rPr>
-        <w:t>2.3 ตารางเปรียบเทียบกำหนดการส่งงานวิชา Cloud Technology</w:t>
+        <w:t>2.3 กำหนดการส่งงานวิชา Cloud Technology</w:t>
       </w:r>
       <w:r>
         <w:rPr>
@@ -1307,7 +1431,7 @@
           <w:b w:val="0"/>
           <w:sz w:val="32"/>
         </w:rPr>
-        <w:t>2.4 เครื่องมือและเฟรมเวิร์กที่ใช้ในการพัฒนา (Tech Stack)</w:t>
+        <w:t>2.4 เทคโนโลยีที่ใช้ในการพัฒนา</w:t>
       </w:r>
       <w:r>
         <w:rPr>
@@ -1334,7 +1458,7 @@
           <w:b w:val="0"/>
           <w:sz w:val="32"/>
         </w:rPr>
-        <w:t>2.5 โมเดลโดเมนและกติกาเกม Disney Lorcana</w:t>
+        <w:t>2.5 กติกาและโมเดลของเกม Disney Lorcana</w:t>
       </w:r>
       <w:r>
         <w:rPr>
@@ -1360,7 +1484,7 @@
           <w:b/>
           <w:sz w:val="32"/>
         </w:rPr>
-        <w:t>บทที่ 3 การวิเคราะห์และออกแบบระบบ (System Analysis &amp; Architectural Design)</w:t>
+        <w:t>บทที่ 3 การวิเคราะห์และออกแบบระบบ</w:t>
       </w:r>
       <w:r>
         <w:rPr>
@@ -1387,7 +1511,7 @@
           <w:b w:val="0"/>
           <w:sz w:val="32"/>
         </w:rPr>
-        <w:t>3.1 ข้อกำหนดความต้องการของระบบ (System Requirements)</w:t>
+        <w:t>3.1 ความต้องการของระบบ</w:t>
       </w:r>
       <w:r>
         <w:rPr>
@@ -1414,7 +1538,7 @@
           <w:b w:val="0"/>
           <w:sz w:val="32"/>
         </w:rPr>
-        <w:t>3.2 การออกแบบสถาปัตยกรรมคลาวด์บน AWS (Dual Infrastructure Model)</w:t>
+        <w:t>3.2 สถาปัตยกรรมระบบคลาวด์บน AWS</w:t>
       </w:r>
       <w:r>
         <w:rPr>
@@ -1441,7 +1565,7 @@
           <w:b w:val="0"/>
           <w:sz w:val="32"/>
         </w:rPr>
-        <w:t>3.3 สถาปัตยกรรมเครือข่ายและการควบคุมต้นทุน (Lean Multi-AZ VPC)</w:t>
+        <w:t>3.3 สถาปัตยกรรมเครือข่าย Lean Multi-AZ VPC</w:t>
       </w:r>
       <w:r>
         <w:rPr>
@@ -1468,7 +1592,7 @@
           <w:b w:val="0"/>
           <w:sz w:val="32"/>
         </w:rPr>
-        <w:t>3.4 การกระจายโหลดและการปรับขนาดอัตโนมัติ (ALB &amp; ASG)</w:t>
+        <w:t>3.4 การกระจายโหลดและการปรับขนาดอัตโนมัติ</w:t>
       </w:r>
       <w:r>
         <w:rPr>
@@ -1495,7 +1619,7 @@
           <w:b w:val="0"/>
           <w:sz w:val="32"/>
         </w:rPr>
-        <w:t>3.5 การออกแบบฐานข้อมูลแบบ NoSQL (Amazon DynamoDB Schema)</w:t>
+        <w:t>3.5 การออกแบบฐานข้อมูล Amazon DynamoDB</w:t>
       </w:r>
       <w:r>
         <w:rPr>
@@ -1522,7 +1646,7 @@
           <w:b w:val="0"/>
           <w:sz w:val="32"/>
         </w:rPr>
-        <w:t>3.6 ลำดับขั้นตอนการทำงานและการสื่อสารแบบเรียลไทม์ (Match Lifecycle v1.5.0)</w:t>
+        <w:t>3.6 วงจรการสื่อสารแบบเรียลไทม์ (Match Lifecycle)</w:t>
       </w:r>
       <w:r>
         <w:rPr>
@@ -1549,7 +1673,7 @@
           <w:b w:val="0"/>
           <w:sz w:val="32"/>
         </w:rPr>
-        <w:t>3.7 การรับมือกับความล้มเหลวของบริการภายนอก (Resilience &amp; Caching)</w:t>
+        <w:t>3.7 การรับมือข้อผิดพลาดและระบบ Caching</w:t>
       </w:r>
       <w:r>
         <w:rPr>
@@ -1576,7 +1700,7 @@
           <w:b w:val="0"/>
           <w:sz w:val="32"/>
         </w:rPr>
-        <w:t>3.8 การปฏิบัติตามกรอบ AWS Well-Architected Framework 5 เสาหลัก</w:t>
+        <w:t>3.8 การออกแบบตามกรอบ AWS Well-Architected Framework</w:t>
       </w:r>
       <w:r>
         <w:rPr>
@@ -1603,7 +1727,7 @@
           <w:b w:val="0"/>
           <w:sz w:val="32"/>
         </w:rPr>
-        <w:t>3.9 การแก้ปัญหาข้อจำกัดทางวิศวกรรมบนสภาพแวดล้อม AWS Learner Lab</w:t>
+        <w:t>3.9 การแก้ปัญหาข้อจำกัดบน AWS Learner Lab</w:t>
       </w:r>
       <w:r>
         <w:rPr>
@@ -1629,7 +1753,7 @@
           <w:b/>
           <w:sz w:val="32"/>
         </w:rPr>
-        <w:t>บทที่ 4 การพัฒนาระบบและผลการดำเนินงาน (Implementation &amp; Test Results)</w:t>
+        <w:t>บทที่ 4 การพัฒนาระบบและผลการดำเนินงาน</w:t>
       </w:r>
       <w:r>
         <w:rPr>
@@ -1656,7 +1780,7 @@
           <w:b w:val="0"/>
           <w:sz w:val="32"/>
         </w:rPr>
-        <w:t>4.1 การพัฒนาส่วนติดต่อผู้ใช้ (Frontend Implementation &amp; Playmat UI)</w:t>
+        <w:t>4.1 การพัฒนาส่วนติดต่อผู้ใช้และ Playmat</w:t>
       </w:r>
       <w:r>
         <w:rPr>
@@ -1683,7 +1807,7 @@
           <w:b w:val="0"/>
           <w:sz w:val="32"/>
         </w:rPr>
-        <w:t>4.2 การพัฒนาส่วนประมวลผลและการบรรจุคอนเทนเนอร์ (Compute &amp; Docker)</w:t>
+        <w:t>4.2 การพัฒนา Backend และ Docker Container</w:t>
       </w:r>
       <w:r>
         <w:rPr>
@@ -1710,7 +1834,7 @@
           <w:b w:val="0"/>
           <w:sz w:val="32"/>
         </w:rPr>
-        <w:t>4.3 ผลการทดสอบระบบและหลักฐานเชิงประจักษ์ (Empirical Test Results)</w:t>
+        <w:t>4.3 ผลการทดสอบระบบ</w:t>
       </w:r>
       <w:r>
         <w:rPr>
@@ -1736,7 +1860,7 @@
           <w:b/>
           <w:sz w:val="32"/>
         </w:rPr>
-        <w:t>บทที่ 5 การประเมินค่าใช้จ่ายบนคลาวด์และแผนงานขั้นต่อไป (Cost Assessment &amp; Future Roadmap)</w:t>
+        <w:t>บทที่ 5 การประเมินค่าใช้จ่ายและแผนงานในอนาคต</w:t>
       </w:r>
       <w:r>
         <w:rPr>
@@ -1763,7 +1887,7 @@
           <w:b w:val="0"/>
           <w:sz w:val="32"/>
         </w:rPr>
-        <w:t>5.1 การประเมินค่าใช้จ่ายสถาปัตยกรรมคลาวด์ ($50 Budget Protection)</w:t>
+        <w:t>5.1 การประเมินค่าใช้จ่ายและการควบคุมงบประมาณ</w:t>
       </w:r>
       <w:r>
         <w:rPr>
@@ -1790,7 +1914,7 @@
           <w:b w:val="0"/>
           <w:sz w:val="32"/>
         </w:rPr>
-        <w:t>5.2 แผนงานการพัฒนาสำหรับ Stage 3 (Sprint 4 ถึง Sprint 7)</w:t>
+        <w:t>5.2 แผนการพัฒนาสำหรับ Stage 3</w:t>
       </w:r>
       <w:r>
         <w:rPr>
@@ -1817,7 +1941,7 @@
           <w:b w:val="0"/>
           <w:sz w:val="32"/>
         </w:rPr>
-        <w:t>5.3 สรุปผลการดำเนินงานและบทเรียนที่ได้รับ (Sprint Retrospective)</w:t>
+        <w:t>5.3 สรุปผลการดำเนินงานและบทเรียนที่ได้รับ</w:t>
       </w:r>
       <w:r>
         <w:rPr>
@@ -1843,7 +1967,7 @@
           <w:b/>
           <w:sz w:val="32"/>
         </w:rPr>
-        <w:t>บรรณานุกรม (References)</w:t>
+        <w:t>บรรณานุกรม</w:t>
       </w:r>
       <w:r>
         <w:rPr>
@@ -1869,7 +1993,7 @@
           <w:b/>
           <w:sz w:val="32"/>
         </w:rPr>
-        <w:t>ภาคผนวก (Appendix)</w:t>
+        <w:t>ภาคผนวก</w:t>
       </w:r>
       <w:r>
         <w:rPr>
@@ -1923,7 +2047,7 @@
           <w:b w:val="0"/>
           <w:sz w:val="32"/>
         </w:rPr>
-        <w:t>ภาคผนวก ข: สคริปต์ 1-Click Scale-to-Zero ควบคุมงบประมาณ</w:t>
+        <w:t>ภาคผนวก ข: สคริปต์ 1-Click Scale-to-Zero สำหรับควบคุมงบประมาณ</w:t>
       </w:r>
       <w:r>
         <w:rPr>
@@ -2062,7 +2186,7 @@
           <w:b w:val="0"/>
           <w:sz w:val="32"/>
         </w:rPr>
-        <w:t>รูปที่ 4.2 กระดานจำลองการเล่นการ์ดแบบเรียลไทม์ (Interactive Playmat Tabletop)</w:t>
+        <w:t>รูปที่ 4.2 กระดานจำลองการเล่นการ์ดแบบเรียลไทม์ Interactive Playmat</w:t>
       </w:r>
       <w:r>
         <w:rPr>
@@ -2088,7 +2212,7 @@
           <w:b w:val="0"/>
           <w:sz w:val="32"/>
         </w:rPr>
-        <w:t>รูปที่ 4.3 ระบบจำลองการสุ่มเปิดซองการ์ดแบบ 3 มิติ (3D Booster Pack Opening)</w:t>
+        <w:t>รูปที่ 4.3 ระบบจำลองการสุ่มเปิดซองการ์ด 3D Booster Pack Opening</w:t>
       </w:r>
       <w:r>
         <w:rPr>
@@ -2201,7 +2325,7 @@
           <w:b w:val="0"/>
           <w:sz w:val="32"/>
         </w:rPr>
-        <w:t>ตารางที่ 3.1 โครงสร้างตารางข้อมูล Amazon DynamoDB (NoSQL Schema)</w:t>
+        <w:t>ตารางที่ 3.1 โครงสร้างตารางข้อมูล Amazon DynamoDB</w:t>
       </w:r>
       <w:r>
         <w:rPr>
@@ -2227,7 +2351,7 @@
           <w:b w:val="0"/>
           <w:sz w:val="32"/>
         </w:rPr>
-        <w:t>ตารางที่ 3.2 ตารางสรุปข้อจำกัดบน AWS Learner Lab และแนวทางแก้ไขเชิงสถาปัตยกรรม</w:t>
+        <w:t>ตารางที่ 3.2 ตารางสรุปข้อจำกัดบน AWS Learner Lab และแนวทางแก้ไข</w:t>
       </w:r>
       <w:r>
         <w:rPr>
@@ -2323,7 +2447,7 @@
           <w:color w:val="000000"/>
           <w:sz w:val="40"/>
         </w:rPr>
-        <w:t>บทนำ (Introduction)</w:t>
+        <w:t>บทนำ</w:t>
       </w:r>
     </w:p>
     <w:p>
@@ -2354,7 +2478,7 @@
           <w:color w:val="000000"/>
           <w:sz w:val="32"/>
         </w:rPr>
-        <w:t>เกมการ์ดสะสมเชิงกลยุทธ์ (Trading Card Game: TCG) เป็นหนึ่งในอุตสาหกรรมเกมและสื่อสันทนาการที่มีอัตราการเติบโตสูงอย่างต่อเนื่องในระดับสากล โดยเฉพาะอย่างยิ่งการเปิดตัวเกม Disney Lorcana TCG โดยความร่วมมือระหว่าง Ravensburger และ The Walt Disney Company ซึ่งได้รับความนิยมอย่างแพร่หลายจากทั้งผู้เล่นสายแข่งขัน (Competitive Players) และนักสะสมทั่วโลก</w:t>
+        <w:t>เกมการ์ดสะสม Disney Lorcana TCG เป็นหนึ่งในเกมที่ได้รับความนิยมสูงอย่างรวดเร็วในระดับสากล โดยเป็นความร่วมมือระหว่าง Ravensburger และ The Walt Disney Company ซึ่งได้รับความสนใจอย่างแพร่หลายจากทั้งผู้เล่นสายแข่งขันและนักสะสมทั่วโลก</w:t>
       </w:r>
     </w:p>
     <w:p>
@@ -2385,7 +2509,7 @@
           <w:color w:val="000000"/>
           <w:sz w:val="32"/>
         </w:rPr>
-        <w:t>1. ต้นทุนการจัดหาการ์ดจริงและข้อจำกัดทางกายภาพ: การ์ดหายากมีราคาสูงในตลาดรอง และการนัดหมายเล่นจำเป็นต้องใช้สถานที่จริง ทำให้ผู้เล่นใหม่ขาดโอกาสในการทดลองจัดเด็ค (Deck Building)</w:t>
+        <w:t>1. ต้นทุนการจัดหาการ์ดจริงและข้อจำกัดทางกายภาพ: การ์ดหายากมีราคาสูงในตลาดรอง และการนัดหมายเล่นจำเป็นต้องใช้สถานที่จริง ทำให้ผู้เล่นใหม่ขาดโอกาสในการทดลองจัดเด็ค</w:t>
       </w:r>
     </w:p>
     <w:p>
@@ -2400,7 +2524,7 @@
           <w:color w:val="000000"/>
           <w:sz w:val="32"/>
         </w:rPr>
-        <w:t>2. ภาระต้นทุนเซิร์ฟเวอร์และความไร้ประสิทธิภาพของระบบดั้งเดิม: ระบบจำลองเกมการ์ดบนอินเทอร์เน็ตในอดีตมักทำงานบน Virtual Machine หรือ Dedicated Server ที่เปิดทิ้งไว้ตลอด 24 ชั่วโมง ก่อให้เกิดค่าใช้จ่ายคงที่สูงแม้ไม่มีผู้ใช้งาน และมักเกิดปัญหาเซิร์ฟเวอร์ล่มเมื่อมีปริมาณทราฟฟิกพุ่งสูงขึ้นอย่างกะทันหัน</w:t>
+        <w:t>2. ภาระต้นทุนเซิร์ฟเวอร์และความไม่คุ้มค่าของระบบแบบเดิม: ระบบจำลองเกมการ์ดบนเว็บในอดีตมักทำงานบน Virtual Machine หรือ Dedicated Server ที่เปิดทิ้งไว้ตลอด 24 ชั่วโมง ก่อให้เกิดค่าใช้จ่ายสูงแม้ไม่มีผู้ใช้งาน และมักเกิดปัญหาเซิร์ฟเวอร์ขัดข้องเมื่อมีผู้ใช้งานเพิ่มขึ้นอย่างกะทันหัน</w:t>
       </w:r>
     </w:p>
     <w:p>
@@ -2415,7 +2539,7 @@
           <w:color w:val="000000"/>
           <w:sz w:val="32"/>
         </w:rPr>
-        <w:t>3. ความหน่วงในการส่งข้อมูล (High Latency): แพลตฟอร์มบนเว็บทั่วไปมักใช้การดึงข้อมูลแบบ HTTP Polling หรือ Long Polling ซึ่งมีความหน่วงสูง ไม่ตอบสนองต่อการเล่นเกมการ์ดที่ต้องการซิงค์ตำแหน่งการ์ด สถานะพร้อมใช้ (Ready/Exert) และแต้มคะแนน (Lore) แบบทันทีทันใด (Real-Time)</w:t>
+        <w:t>3. ปัญหาความหน่วงในการส่งข้อมูล (Latency): แพลตฟอร์มบนเว็บทั่วไปมักใช้การดึงข้อมูลแบบ HTTP Polling ซึ่งมีความหน่วงสูง ไม่ตอบสนองต่อการเล่นเกมการ์ดที่ต้องการซิงค์ตำแหน่งการ์ด สถานะ Ready หรือ Exert และแต้ม Lore แบบทันทีทันใด</w:t>
       </w:r>
     </w:p>
     <w:p>
@@ -2431,7 +2555,7 @@
           <w:color w:val="000000"/>
           <w:sz w:val="32"/>
         </w:rPr>
-        <w:t>เพื่อแก้ไขปัญหาดังกล่าว คณะผู้จัดทำจึงได้ริเริ่มโครงงาน Disney Lorcana PlayLab Cloud (กลุ่ม G21) โดยนำสถาปัตยกรรมคลาวด์แบบผสมผสาน (Hybrid Cloud Architecture) ซึ่งใช้ Primary IaaS Stack (Lean Multi-AZ VPC, ALB, Auto Scaling Group, Docker) ร่วมกับ Secondary Serverless Mode (AWS Lambda, DynamoDB, API Gateway) มาใช้ในการพัฒนาระบบจำลองกระดานเล่นการ์ดและระบบวิเคราะห์เด็คอัจฉริยะ ที่มีความหน่วงต่ำกว่า 100 มิลลิวินาที สามารถขยายขนาดรองรับผู้เล่นได้โดยอัตโนมัติ และควบคุมค่าใช้จ่ายโครงสร้างพื้นฐานให้อยู่ภายใต้งบประมาณจำกัด $50 ของ AWS Learner Lab ได้อย่างสมบูรณ์</w:t>
+        <w:t>เพื่อแก้ไขปัญหาดังกล่าว คณะผู้จัดทำจึงได้พัฒนาโครงงาน Disney Lorcana PlayLab Cloud โดยนำสถาปัตยกรรม Hybrid Cloud ซึ่งใช้ Primary IaaS Stack บน Lean Multi-AZ VPC, Application Load Balancer, Auto Scaling Group และ Docker ร่วมกับ Secondary Serverless Stack บน AWS Lambda, DynamoDB และ API Gateway เพื่อสร้างระบบจำลองกระดานเล่นการ์ดและวิเคราะห์เด็คที่มีความหน่วงต่ำกว่า 100 มิลลิวินาที สามารถขยายขนาดรองรับผู้เล่นได้อัตโนมัติ และควบคุมค่าใช้จ่ายให้อยู่ภายใต้งบประมาณ $50 ของ AWS Learner Lab ได้อย่างมีประสิทธิภาพ</w:t>
       </w:r>
     </w:p>
     <w:p>
@@ -2461,7 +2585,7 @@
           <w:color w:val="000000"/>
           <w:sz w:val="32"/>
         </w:rPr>
-        <w:t>1. เพื่อออกแบบและพัฒนาระบบจำลองกระดานซ้อมเล่นการ์ด Disney Lorcana แบบเรียลไทม์บนเว็บเบราว์เซอร์ที่มีความหน่วงต่ำ (&lt;100ms) ผ่านช่องทางสื่อสารสองทิศทาง WebSockets (Match Lifecycle v1.5.0)</w:t>
+        <w:t>1. เพื่อออกแบบและพัฒนาระบบจำลองกระดานซ้อมเล่นการ์ด Disney Lorcana แบบเรียลไทม์บนเว็บเบราว์เซอร์ที่มีความหน่วงต่ำกว่า 100 มิลลิวินาที ผ่านช่องทางสื่อสาร WebSockets</w:t>
       </w:r>
     </w:p>
     <w:p>
@@ -2476,7 +2600,7 @@
           <w:color w:val="000000"/>
           <w:sz w:val="32"/>
         </w:rPr>
-        <w:t>2. เพื่อประยุกต์ใช้สถาปัตยกรรมคลาวด์แบบ IaaS และ Containerization (Multi-AZ VPC, ALB, EC2 Auto Scaling Group, Docker) ในการสร้างระบบที่มีความพร้อมใช้งานสูงและปรับขนาดตามโหลดอัตโนมัติ (Elasticity CPU &gt; 60%)</w:t>
+        <w:t>2. เพื่อประยุกต์ใช้สถาปัตยกรรมคลาวด์แบบ IaaS และ Containerization บน Multi-AZ VPC, ALB, EC2 Auto Scaling Group และ Docker ในการสร้างระบบที่มีความพร้อมใช้งานสูงและปรับขนาดตามโหลดอัตโนมัติเมื่อ CPU เกิน 60%</w:t>
       </w:r>
     </w:p>
     <w:p>
@@ -2491,7 +2615,7 @@
           <w:color w:val="000000"/>
           <w:sz w:val="32"/>
         </w:rPr>
-        <w:t>3. เพื่อพัฒนาระบบจัดการเด็คการ์ด (Deck Builder) และระบบประมวลผลวิเคราะห์สมดุลเด็คแบบ Asynchronous ผ่าน Amazon SQS พร้อมฐานข้อมูลการ์ดทางการครบถ้วนกว่า 3,242 ใบ</w:t>
+        <w:t>3. เพื่อพัฒนาระบบจัดการเด็คการ์ดและระบบประมวลผลวิเคราะห์เด็คแบบ Asynchronous ผ่าน Amazon SQS พร้อมฐานข้อมูลการ์ดทางการครบถ้วน 3,242 ใบ</w:t>
       </w:r>
     </w:p>
     <w:p>
@@ -2506,7 +2630,7 @@
           <w:color w:val="000000"/>
           <w:sz w:val="32"/>
         </w:rPr>
-        <w:t>4. เพื่อศึกษาและวางมาตรการด้านความเชื่อถือได้ (Reliability), ความพร้อมใช้งาน (Availability), ความปลอดภัย (Security) และการควบคุมต้นทุน (Cost Optimization) ตามกรอบ AWS Well-Architected Framework</w:t>
+        <w:t>4. เพื่อศึกษาและวางมาตรการด้าน Reliability, Availability, Security และ Cost Optimization ตามกรอบ AWS Well-Architected Framework</w:t>
       </w:r>
     </w:p>
     <w:p>
@@ -2521,7 +2645,7 @@
           <w:color w:val="000000"/>
           <w:sz w:val="32"/>
         </w:rPr>
-        <w:t>5. เพื่อศึกษาและแก้ไขปัญหาข้อจำกัดทางวิศวกรรมบนสภาพแวดล้อมสิทธิ์จำกัดและงบประมาณจำกัด ($50) ของ AWS Academy Learner Lab ด้วยกลยุทธ์ Lean Multi-AZ VPC และ 1-Click Scale-to-Zero</w:t>
+        <w:t>5. เพื่อศึกษาและแก้ไขปัญหาข้อจำกัดทางวิศวกรรมบนสภาพแวดล้อมสิทธิ์จำกัดและงบประมาณ $50 ของ AWS Academy Learner Lab ด้วยกลยุทธ์ Lean Multi-AZ VPC และ 1-Click Scale-to-Zero</w:t>
       </w:r>
     </w:p>
     <w:p>
@@ -2536,7 +2660,7 @@
           <w:color w:val="000000"/>
           <w:sz w:val="36"/>
         </w:rPr>
-        <w:t>1.3 ขอบเขตของระบบ (System Scope)</w:t>
+        <w:t>1.3 ขอบเขตของระบบ</w:t>
       </w:r>
     </w:p>
     <w:p>
@@ -2552,7 +2676,7 @@
           <w:color w:val="000000"/>
           <w:sz w:val="32"/>
         </w:rPr>
-        <w:t>ระบบครอบคลุมฟังก์ชันการทำงานหลัก 9 ด้าน (9 Core Use Cases: LC-01 ถึง LC-09) ดังต่อไปนี้:</w:t>
+        <w:t>ระบบครอบคลุมฟังก์ชันการทำงานหลัก 9 ด้าน ดังต่อไปนี้:</w:t>
       </w:r>
     </w:p>
     <w:p>
@@ -2567,7 +2691,7 @@
           <w:color w:val="000000"/>
           <w:sz w:val="32"/>
         </w:rPr>
-        <w:t>• ระบบยืนยันตัวตนและความปลอดภัย (Authentication - LC-01, LC-02): สมัครสมาชิกและเข้าสู่ระบบด้วย Custom bcrypt Hash + JWT State Management บน Local Storage รองรับผู้ใช้ทั่วไปและระบบ Demo</w:t>
+        <w:t>• ระบบยืนยันตัวตนและความปลอดภัย (LC-01, LC-02): สมัครสมาชิกและเข้าสู่ระบบด้วย bcrypt และ JWT State Management บน Local Storage รองรับผู้ใช้ทั่วไปและระบบ Demo</w:t>
       </w:r>
     </w:p>
     <w:p>
@@ -2582,7 +2706,7 @@
           <w:color w:val="000000"/>
           <w:sz w:val="32"/>
         </w:rPr>
-        <w:t>• ระบบจัดการเด็คการ์ด (Deck Management - LC-03): สร้าง ค้นหา แก้ไข และบันทึกเด็คการ์ดลงฐานข้อมูล Amazon DynamoDB โดยมีระบบตรวจสอบกฎกติกาการจัดเด็ค (ความจุขั้นต่ำ 60 ใบ, ใส่การ์ดซ้ำได้ไม่เกิน 4 ใบ, และจำกัดหมึกสีไม่เกิน 2 สี)</w:t>
+        <w:t>• ระบบจัดการเด็คการ์ด (LC-03): สร้าง ค้นหา แก้ไข และบันทึกเด็คการ์ดลง Amazon DynamoDB พร้อมระบบตรวจสอบกฎกติกาการจัดเด็ค ได้แก่ ความจุขั้นต่ำ 60 ใบ, ใส่การ์ดซ้ำได้ไม่เกิน 4 ใบ, และจำกัดหมึกไม่เกิน 2 สี</w:t>
       </w:r>
     </w:p>
     <w:p>
@@ -2597,7 +2721,7 @@
           <w:color w:val="000000"/>
           <w:sz w:val="32"/>
         </w:rPr>
-        <w:t>• ระบบจำลองการเปิดซองการ์ด (Booster Pack Gacha Simulator - LC-04): สุ่มเปิดการ์ด 12 ใบต่อซองตามอัตราการออกการ์ดจริง (Common, Uncommon, Rare, Super Rare, Legendary, Enchanted) ด้วยอัลกอริทึม Fisher-Yates True Randomization</w:t>
+        <w:t>• ระบบจำลองการเปิดซองการ์ด Booster Pack (LC-04): สุ่มเปิดการ์ด 12 ใบต่อซองตามอัตราการออกการ์ดจริงด้วยอัลกอริทึม Fisher-Yates True Randomization</w:t>
       </w:r>
     </w:p>
     <w:p>
@@ -2612,7 +2736,7 @@
           <w:color w:val="000000"/>
           <w:sz w:val="32"/>
         </w:rPr>
-        <w:t>• ระบบตรวจสอบการ์ดแบบ 3 มิติ (3D Card Inspector - LC-05): แสดงผลการ์ดสามมิติพร้อมเอฟเฟกต์ Holographic Foil Shader และการตอบสนองต่อการเคลื่อนที่ของเคอร์เซอร์เมาส์ (Mouse Tilt Physics)</w:t>
+        <w:t>• ระบบตรวจสอบการ์ด 3D Card Inspector (LC-05): แสดงผลการ์ดสามมิติพร้อมเอฟเฟกต์ Holographic Foil Shader และการตอบสนองต่อการเคลื่อนที่ของเมาส์</w:t>
       </w:r>
     </w:p>
     <w:p>
@@ -2627,7 +2751,7 @@
           <w:color w:val="000000"/>
           <w:sz w:val="32"/>
         </w:rPr>
-        <w:t>• ระบบห้องแข่งขันแบบเรียลไทม์ (Matchmaking &amp; Lobby - LC-06): สร้างห้องแข่งขันด้วยรหัส 6 หลัก (Room Code), ระบบค้นหาห้อง และระบบสลับบทบาทผู้เล่น Player 1, Player 2 และ Spectator</w:t>
+        <w:t>• ระบบจับคู่และห้องแข่งขัน (LC-06): สร้างห้องแข่งขันด้วยรหัส 6 หลัก ระบบค้นหาห้อง และระบบสลับบทบาทผู้เล่น Player 1, Player 2 และ Spectator</w:t>
       </w:r>
     </w:p>
     <w:p>
@@ -2642,7 +2766,7 @@
           <w:color w:val="000000"/>
           <w:sz w:val="32"/>
         </w:rPr>
-        <w:t>• กระดานจำลองการเล่นการ์ดแบบ Interactive (Real-Time Playmat - LC-07): จำลองพื้นที่กระดานมาตรฐาน ประกอบด้วย Play Area, Inkwell, Deck, Discard Pile, Hand, และ Lore Counter (0-20 แต้ม)</w:t>
+        <w:t>• กระดานจำลองการเล่นการ์ด Interactive Playmat (LC-07): จำลองพื้นที่กระดานมาตรฐาน ประกอบด้วย Play Area, Inkwell, Deck, Discard Pile, Hand และ Lore Counter</w:t>
       </w:r>
     </w:p>
     <w:p>
@@ -2657,7 +2781,7 @@
           <w:color w:val="000000"/>
           <w:sz w:val="32"/>
         </w:rPr>
-        <w:t>• ระบบกู้คืนสถานะการเชื่อมต่อ (Rejoin Grace Period 60s - LC-08): รักษาช่องว่างห้องเล่นไว้ 60 วินาทีเมื่อผู้เล่นหลุดจากการเชื่อมต่อ เพื่อให้สามารถเชื่อมต่อกลับเข้ามาเล่นต่อได้โดยเกมไม่หยุดชะงัก</w:t>
+        <w:t>• ระบบกู้คืนสถานะการเชื่อมต่อ Rejoin Grace Period 60 วินาที (LC-08): รักษาช่องว่างห้องเล่นไว้ 60 วินาทีเมื่อผู้เล่นหลุดจากการเชื่อมต่อ เพื่อให้สามารถเชื่อมต่อกลับเข้ามาเล่นต่อได้โดยเกมไม่หยุดชะงัก</w:t>
       </w:r>
     </w:p>
     <w:p>
@@ -2672,7 +2796,7 @@
           <w:color w:val="000000"/>
           <w:sz w:val="32"/>
         </w:rPr>
-        <w:t>• ระบบออกจากเกมโดยสมัครใจ (Voluntary Exit Match - LC-09): ส่ง Action LEAVE_ROOM เคลียร์สล็อตในห้องเล่นทันที เพื่อคืนทรัพยากรห้องเล่นให้ระบบ</w:t>
+        <w:t>• ระบบออกจากเกม Voluntary Exit Match (LC-09): ส่ง Action LEAVE_ROOM เคลียร์สล็อตในห้องเล่นบน DynamoDB ทันที เพื่อคืนทรัพยากรห้องเล่นให้ระบบ</w:t>
       </w:r>
     </w:p>
     <w:p>
@@ -2717,7 +2841,7 @@
           <w:color w:val="000000"/>
           <w:sz w:val="32"/>
         </w:rPr>
-        <w:t>2. ได้รับองค์ความรู้และทักษะเชิงลึกในการออกแบบสถาปัตยกรรมคลาวด์แบบ IaaS และ Containerization (Multi-AZ VPC, ALB, ASG, Docker) ที่รองรับงานในระดับ Production</w:t>
+        <w:t>2. ได้รับองค์ความรู้และทักษะเชิงลึกในการออกแบบสถาปัตยกรรมคลาวด์แบบ IaaS และ Containerization ที่รองรับการใช้งานระดับ Production</w:t>
       </w:r>
     </w:p>
     <w:p>
@@ -2747,7 +2871,7 @@
           <w:color w:val="000000"/>
           <w:sz w:val="32"/>
         </w:rPr>
-        <w:t>4. มีระบบต้นแบบในการจัดการ State การเล่นเกมแบบเรียลไทม์ความเร็วสูงผ่าน WebSockets และการกู้คืนสถานะด้วย NoSQL (Amazon DynamoDB)</w:t>
+        <w:t>4. มีระบบต้นแบบในการจัดการ State การเล่นเกมแบบเรียลไทม์ความเร็วสูงผ่าน WebSockets และการกู้คืนสถานะด้วย NoSQL บน Amazon DynamoDB</w:t>
       </w:r>
     </w:p>
     <w:p>
@@ -2808,7 +2932,7 @@
           <w:color w:val="000000"/>
           <w:sz w:val="32"/>
         </w:rPr>
-        <w:t>• บทที่ 2 การบริหารจัดการโครงการและเครื่องมือที่ใช้: ระเบียบวิธี Agile Scrum, แผนการดำเนินงาน Sprint 1-3, Tech Stack และกฎกติกาเกม</w:t>
+        <w:t>• บทที่ 2 การบริหารจัดการโครงการและเทคโนโลยีที่ใช้: ระเบียบวิธี Agile Scrum, แผนการดำเนินงาน Sprint 1 ถึง 3, Tech Stack และกฎกติกาเกม</w:t>
       </w:r>
     </w:p>
     <w:p>
@@ -2823,7 +2947,7 @@
           <w:color w:val="000000"/>
           <w:sz w:val="32"/>
         </w:rPr>
-        <w:t>• บทที่ 3 การวิเคราะห์และออกแบบระบบ: สถาปัตยกรรมคลาวด์ Dual-Model, Lean Multi-AZ VPC, ALB/ASG, โครงสร้าง DynamoDB, Match Lifecycle, และการรับมือข้อจำกัด AWS Learner Lab</w:t>
+        <w:t>• บทที่ 3 การวิเคราะห์และออกแบบระบบ: สถาปัตยกรรมคลาวด์, Lean Multi-AZ VPC, ALB, ASG, โครงสร้าง DynamoDB, Match Lifecycle และการรับมือข้อจำกัด AWS Learner Lab</w:t>
       </w:r>
     </w:p>
     <w:p>
@@ -2838,7 +2962,7 @@
           <w:color w:val="000000"/>
           <w:sz w:val="32"/>
         </w:rPr>
-        <w:t>• บทที่ 4 การพัฒนาระบบและผลการดำเนินงาน: รายละเอียดการพัฒนา Frontend React 19, Multi-stage Docker, และผลการทดสอบระบบทั้ง Unit Test, E2E Test, Load Test</w:t>
+        <w:t>• บทที่ 4 การพัฒนาระบบและผลการดำเนินงาน: รายละเอียดการพัฒนา Frontend React 19, Multi-stage Docker และผลการทดสอบระบบ</w:t>
       </w:r>
     </w:p>
     <w:p>
@@ -2853,7 +2977,7 @@
           <w:color w:val="000000"/>
           <w:sz w:val="32"/>
         </w:rPr>
-        <w:t>• บทที่ 5 การประเมินค่าใช้จ่ายบนคลาวด์และแผนงานขั้นต่อไป: สรุปค่าใช้จ่ายจริงเทียบกับงบประมาณ $50, แผนงาน Sprint 4-7, และบทเรียนที่ได้รับ (Sprint Retrospective)</w:t>
+        <w:t>• บทที่ 5 การประเมินค่าใช้จ่ายและแผนงานในอนาคต: สรุปค่าใช้จ่ายจริงเทียบกับงบประมาณ $50, แผนงาน Sprint 4 ถึง 7 และบทเรียนที่ได้รับ</w:t>
       </w:r>
     </w:p>
     <w:p>
@@ -2888,7 +3012,7 @@
           <w:color w:val="000000"/>
           <w:sz w:val="40"/>
         </w:rPr>
-        <w:t>การบริหารจัดการโครงการและเครื่องมือที่ใช้ (Project Management &amp; Tech Stack)</w:t>
+        <w:t>การบริหารจัดการโครงการและเทคโนโลยีที่ใช้</w:t>
       </w:r>
     </w:p>
     <w:p>
@@ -2903,7 +3027,7 @@
           <w:color w:val="000000"/>
           <w:sz w:val="36"/>
         </w:rPr>
-        <w:t>2.1 ระเบียบวิธีปฏิบัติงานแบบ Agile Scrum และแผนการพัฒนา</w:t>
+        <w:t>2.1 แผนการพัฒนาและระเบียบวิธี Agile Scrum</w:t>
       </w:r>
     </w:p>
     <w:p>
@@ -2919,7 +3043,7 @@
           <w:color w:val="000000"/>
           <w:sz w:val="32"/>
         </w:rPr>
-        <w:t>โครงการ Disney Lorcana PlayLab Cloud ใช้ระเบียบวิธีปฏิบัติงานแบบ Agile Scrum โดยแบ่งระยะเวลาการพัฒนาออกเป็น 7 Sprints (Sprint ละ 2 สัปดาห์) การดำเนินงานใน Phase ที่ 2 ครอบคลุมการพัฒนาตั้งแต่ Sprint 1 ถึง Sprint 3 ซึ่งมุ่งเน้นการสร้างสถาปัตยกรรมหลักของระบบ (Core Infrastructure) และการเชื่อมต่อฟังก์ชันพื้นฐานครบ 100% ดังแสดงในตารางที่ 2.1</w:t>
+        <w:t>โครงการ Disney Lorcana PlayLab Cloud ใช้ระเบียบวิธีปฏิบัติงานแบบ Agile Scrum โดยแบ่งระยะเวลาการพัฒนาออกเป็น 7 Sprints (Sprint ละ 2 สัปดาห์) การดำเนินงานใน Phase ที่ 2 ครอบคลุมการพัฒนาตั้งแต่ Sprint 1 ถึง Sprint 3 ซึ่งมุ่งเน้นการสร้างสถาปัตยกรรมหลักของระบบและเชื่อมต่อฟังก์ชันพื้นฐานครบ 100% ดังแสดงในตารางที่ 2.1</w:t>
       </w:r>
     </w:p>
     <w:p>
@@ -3156,7 +3280,7 @@
                 <w:rFonts w:ascii="TH Sarabun New" w:hAnsi="TH Sarabun New"/>
                 <w:sz w:val="28"/>
               </w:rPr>
-              <w:t>เสร็จสมบูรณ์ (100%)</w:t>
+              <w:t>เสร็จสมบูรณ์ 100%</w:t>
             </w:r>
           </w:p>
         </w:tc>
@@ -3254,7 +3378,7 @@
                 <w:rFonts w:ascii="TH Sarabun New" w:hAnsi="TH Sarabun New"/>
                 <w:sz w:val="28"/>
               </w:rPr>
-              <w:t>เสร็จสมบูรณ์ (100%)</w:t>
+              <w:t>เสร็จสมบูรณ์ 100%</w:t>
             </w:r>
           </w:p>
         </w:tc>
@@ -3352,7 +3476,7 @@
                 <w:rFonts w:ascii="TH Sarabun New" w:hAnsi="TH Sarabun New"/>
                 <w:sz w:val="28"/>
               </w:rPr>
-              <w:t>เสร็จสมบูรณ์ (100%)</w:t>
+              <w:t>เสร็จสมบูรณ์ 100%</w:t>
             </w:r>
           </w:p>
         </w:tc>
@@ -3720,7 +3844,7 @@
                 <w:rFonts w:ascii="TH Sarabun New" w:hAnsi="TH Sarabun New"/>
                 <w:sz w:val="28"/>
               </w:rPr>
-              <w:t>จัดทำรายงานฉบับสมบูรณ์ (Final Report), บันทึกวิดีโอสาธิตระบบ และเตรียมการนำเสนอครั้งสุดท้าย</w:t>
+              <w:t>จัดทำรายงานฉบับสมบูรณ์ บันทึกวิดีโอสาธิตระบบ และเตรียมการนำเสนอครั้งสุดท้าย</w:t>
             </w:r>
           </w:p>
         </w:tc>
@@ -3762,7 +3886,7 @@
           <w:color w:val="000000"/>
           <w:sz w:val="36"/>
         </w:rPr>
-        <w:t>2.2 สรุปผลความก้าวหน้าการดำเนินงาน Sprint 1 ถึง Sprint 3</w:t>
+        <w:t>2.2 สรุปผลความก้าวหน้า Sprint 1 ถึง Sprint 3</w:t>
       </w:r>
     </w:p>
     <w:p>
@@ -3778,7 +3902,7 @@
           <w:color w:val="000000"/>
           <w:sz w:val="32"/>
         </w:rPr>
-        <w:t>ความก้าวหน้าของโครงการ ณ วันที่ 4 กันยายน 2569 บรรลุตามเป้าหมายของ Stage 2 อย่างสมบูรณ์ ทีมงานได้พัฒนาและทดสอบส่วนประกอบสำคัญของระบบครบทุกมิติ:</w:t>
+        <w:t>ความก้าวหน้าของโครงการ ณ วันที่ 4 กันยายน 2569 บรรลุตามเป้าหมายของ Stage 2 ครบถ้วน ทีมงานได้พัฒนาและทดสอบส่วนประกอบสำคัญของระบบครบทุกมิติ:</w:t>
       </w:r>
     </w:p>
     <w:p>
@@ -3793,7 +3917,7 @@
           <w:color w:val="000000"/>
           <w:sz w:val="32"/>
         </w:rPr>
-        <w:t>• ด้าน Frontend และ Client State: พัฒนาด้วย React 19, TypeScript 5.x, Zustand Store, Tailwind CSS v4 และ Framer Motion มีความเสถียรและผ่านการทดสอบ Vitest ครบ 33 ข้อทดสอบ</w:t>
+        <w:t>• Frontend และ Client State: พัฒนาด้วย React 19, TypeScript 5.x, Zustand Store, Tailwind CSS v4 และ Framer Motion มีความเสถียรและผ่านการทดสอบ Vitest ครบ 33 ข้อทดสอบ</w:t>
       </w:r>
     </w:p>
     <w:p>
@@ -3808,7 +3932,7 @@
           <w:color w:val="000000"/>
           <w:sz w:val="32"/>
         </w:rPr>
-        <w:t>• ด้าน Backend และ Real-Time Engine: รวมศูนย์ระบบไว้ที่ Nginx Reverse Proxy และ Express/WebSocket Engine (backend/server.ts) ภายใน Multi-stage Docker Container รองรับการสื่อสารสองทิศทางที่มีความหน่วงเฉลี่ยต่ำกว่า 50 มิลลิวินาที</w:t>
+        <w:t>• Backend และ Real-Time Engine: รวมศูนย์ระบบไว้ที่ Nginx Reverse Proxy และ Express/WebSocket Engine ภายใน Multi-stage Docker Container รองรับการสื่อสารสองทิศทางที่มีความหน่วงเฉลี่ยต่ำกว่า 50 มิลลิวินาที</w:t>
       </w:r>
     </w:p>
     <w:p>
@@ -3823,7 +3947,7 @@
           <w:color w:val="000000"/>
           <w:sz w:val="32"/>
         </w:rPr>
-        <w:t>• ด้าน Cloud Infrastructure บน AWS: ปรับใช้ Lean Multi-AZ VPC สองโซน (us-east-1a, us-east-1b) พร้อม Application Load Balancer และ Auto Scaling Group ที่สามารถปรับขนาดเครื่อง EC2 t3.micro ได้อย่างอัตโนมัติเมื่อ CPU เกิน 60%</w:t>
+        <w:t>• Cloud Infrastructure บน AWS: ปรับใช้ Lean Multi-AZ VPC สองโซน (us-east-1a, us-east-1b) พร้อม Application Load Balancer และ Auto Scaling Group ที่สามารถปรับขนาดเครื่อง EC2 t3.micro ได้อัตโนมัติเมื่อ CPU เกิน 60%</w:t>
       </w:r>
     </w:p>
     <w:p>
@@ -3838,7 +3962,7 @@
           <w:color w:val="000000"/>
           <w:sz w:val="32"/>
         </w:rPr>
-        <w:t>• ด้านระบบอัตโนมัติและการควบคุมงบประมาณ: พัฒนาสคริปต์ PowerShell สำหรับการ Deploy (deploy_ec2_vpc_asg.ps1), สคริปต์ยิงทดสอบโหลด (stress_test.ps1), และสคริปต์ Scale-to-Zero (lab_start.ps1, lab_stop.ps1) ที่ช่วยประหยัดงบประมาณของ Learner Lab</w:t>
+        <w:t>• ระบบอัตโนมัติและการควบคุมงบประมาณ: พัฒนาสคริปต์ PowerShell สำหรับการ Deploy, สคริปต์ยิงทดสอบโหลด และสคริปต์ 1-Click Scale-to-Zero ที่ช่วยตัดค่าใช้จ่าย Compute เหลือ $0.00 เมื่อไม่ได้ใช้งาน</w:t>
       </w:r>
     </w:p>
     <w:p>
@@ -3853,7 +3977,7 @@
           <w:color w:val="000000"/>
           <w:sz w:val="36"/>
         </w:rPr>
-        <w:t>2.3 ตารางเปรียบเทียบกำหนดการส่งงานวิชา Cloud Technology</w:t>
+        <w:t>2.3 กำหนดการส่งงานวิชา Cloud Technology</w:t>
       </w:r>
     </w:p>
     <w:p>
@@ -4443,7 +4567,7 @@
           <w:color w:val="000000"/>
           <w:sz w:val="36"/>
         </w:rPr>
-        <w:t>2.4 เครื่องมือและเฟรมเวิร์กที่ใช้ในการพัฒนา (Tech Stack)</w:t>
+        <w:t>2.4 เทคโนโลยีที่ใช้ในการพัฒนา</w:t>
       </w:r>
     </w:p>
     <w:p>
@@ -4459,7 +4583,7 @@
           <w:color w:val="000000"/>
           <w:sz w:val="32"/>
         </w:rPr>
-        <w:t>ระบบ Disney Lorcana PlayLab Cloud เลือกใช้ชุดเครื่องมือระดับมาตรฐานอุตสาหกรรม (Production-grade Tech Stack):</w:t>
+        <w:t>ระบบ Disney Lorcana PlayLab Cloud เลือกใช้ชุดเครื่องมือมาตรฐานระดับ Production:</w:t>
       </w:r>
     </w:p>
     <w:p>
@@ -4474,7 +4598,7 @@
           <w:color w:val="000000"/>
           <w:sz w:val="32"/>
         </w:rPr>
-        <w:t>• Frontend: React 19, TypeScript 5.x, Vite 6.x, Tailwind CSS v4, Framer Motion, Lucide React, Zustand State Management</w:t>
+        <w:t>• Frontend: React 19, TypeScript 5.x, Vite 6.x, Tailwind CSS v4, Framer Motion, Lucide React, และ Zustand State Management</w:t>
       </w:r>
     </w:p>
     <w:p>
@@ -4489,7 +4613,7 @@
           <w:color w:val="000000"/>
           <w:sz w:val="32"/>
         </w:rPr>
-        <w:t>• Backend &amp; Realtime: Node.js 20 LTS, Express, ws (WebSockets RFC 6455), bcryptjs, jsonwebtoken, AWS SDK v3</w:t>
+        <w:t>• Backend &amp; Realtime: Node.js 20 LTS, Express, WebSockets (RFC 6455), bcryptjs, jsonwebtoken, และ AWS SDK v3</w:t>
       </w:r>
     </w:p>
     <w:p>
@@ -4504,7 +4628,7 @@
           <w:color w:val="000000"/>
           <w:sz w:val="32"/>
         </w:rPr>
-        <w:t>• Cloud Infrastructure (AWS): Amazon EC2 (t3.micro), Application Load Balancer (ALB), EC2 Auto Scaling Group (ASG), Amazon Virtual Private Cloud (VPC), Amazon DynamoDB (NoSQL), Amazon SQS, AWS CloudWatch, AWS Systems Manager (SSM)</w:t>
+        <w:t>• Cloud Infrastructure บน AWS: Amazon EC2 (t3.micro), Application Load Balancer (ALB), EC2 Auto Scaling Group (ASG), Amazon Virtual Private Cloud (VPC), Amazon DynamoDB, Amazon SQS, AWS CloudWatch, และ AWS Systems Manager (SSM)</w:t>
       </w:r>
     </w:p>
     <w:p>
@@ -4519,7 +4643,7 @@
           <w:color w:val="000000"/>
           <w:sz w:val="32"/>
         </w:rPr>
-        <w:t>• Containerization &amp; Web Server: Docker Engine, Multi-stage Alpine Build, Nginx Reverse Proxy (Port 80 to Port 3001)</w:t>
+        <w:t>• Containerization &amp; Web Server: Docker Engine, Multi-stage Alpine Build, และ Nginx Reverse Proxy</w:t>
       </w:r>
     </w:p>
     <w:p>
@@ -4534,7 +4658,7 @@
           <w:color w:val="000000"/>
           <w:sz w:val="32"/>
         </w:rPr>
-        <w:t>• Testing &amp; Automation: Vitest 4.x, Playwright E2E, PowerShell Automation Suite (deploy, stress test, scale-to-zero)</w:t>
+        <w:t>• Testing &amp; Automation: Vitest 4.x, Playwright E2E, และ PowerShell Automation Suite</w:t>
       </w:r>
     </w:p>
     <w:p>
@@ -4549,7 +4673,7 @@
           <w:color w:val="000000"/>
           <w:sz w:val="36"/>
         </w:rPr>
-        <w:t>2.5 โมเดลโดเมนและกติกาเกม Disney Lorcana</w:t>
+        <w:t>2.5 กติกาและโมเดลของเกม Disney Lorcana</w:t>
       </w:r>
     </w:p>
     <w:p>
@@ -4580,7 +4704,7 @@
           <w:color w:val="000000"/>
           <w:sz w:val="32"/>
         </w:rPr>
-        <w:t>• ทรัพยากรหมึก (Ink &amp; Inkwell): การ์ดที่มีสัญลักษณ์หมึกคว่ำลงใน Inkwell เพื่อใช้จ่ายเป็นค่าร่ายการ์ด (Cost) ในแต่ละเทิร์น</w:t>
+        <w:t>• ทรัพยากรหมึก (Inkwell): การ์ดที่มีสัญลักษณ์หมึกสามารถคว่ำลงใน Inkwell เพื่อใช้จ่ายเป็นค่าร่ายการ์ดในแต่ละเทิร์น</w:t>
       </w:r>
     </w:p>
     <w:p>
@@ -4595,7 +4719,7 @@
           <w:color w:val="000000"/>
           <w:sz w:val="32"/>
         </w:rPr>
-        <w:t>• สถานะการ์ด (Ready &amp; Exert): การ์ดในกระดานจะตั้งตรง (Ready) เมื่อพร้อมใช้งาน และหมุนแนวนอน 90 องศา (Exert) เมื่อทำเควสต์ ท้าทาย หรือร้องเพลง</w:t>
+        <w:t>• สถานะการ์ด Ready และ Exert: การ์ดในกระดานจะตั้งตรง (Ready) เมื่อพร้อมใช้งาน และหมุนแนวนอน 90 องศา (Exert) เมื่อทำเควสต์ ท้าทาย หรือร้องเพลง</w:t>
       </w:r>
     </w:p>
     <w:p>
@@ -4610,7 +4734,7 @@
           <w:color w:val="000000"/>
           <w:sz w:val="32"/>
         </w:rPr>
-        <w:t>• แต้มความรู้ (Lore Counter): ผู้เล่นสะสมแต้มความรู้จากการส่งตัวละครทำเควสต์ ผู้ที่สะสมแต้มครบ 20 แต้มก่อนจะเป็นผู้ชนะในแมตช์</w:t>
+        <w:t>• แต้ม Lore: ผู้เล่นสะสมแต้มความรู้จากการส่งตัวละครทำเควสต์ ผู้ที่สะสมแต้มครบ 20 แต้มก่อนจะเป็นผู้ชนะในแมตช์</w:t>
       </w:r>
     </w:p>
     <w:p>
@@ -4625,7 +4749,7 @@
           <w:color w:val="000000"/>
           <w:sz w:val="32"/>
         </w:rPr>
-        <w:t>• กฎการจัดเด็ค (Deck Constraints): เด็คต้องประกอบด้วยการ์ดอย่างน้อย 60 ใบ, มีสีหมึกไม่เกิน 2 สีจาก 6 สี (Amber, Amethyst, Emerald, Ruby, Sapphire, Steel), และใส่การ์ดชื่อเดียวกันได้ไม่เกิน 4 ใบ</w:t>
+        <w:t>• กฎการจัดเด็ค: เด็คต้องประกอบด้วยการ์ดอย่างน้อย 60 ใบ, มีสีหมึกไม่เกิน 2 สีจาก 6 สี (Amber, Amethyst, Emerald, Ruby, Sapphire, Steel), และใส่การ์ดชื่อเดียวกันได้ไม่เกิน 4 ใบ</w:t>
       </w:r>
     </w:p>
     <w:p>
@@ -4660,7 +4784,7 @@
           <w:color w:val="000000"/>
           <w:sz w:val="40"/>
         </w:rPr>
-        <w:t>การวิเคราะห์และออกแบบระบบ (System Analysis &amp; Architectural Design)</w:t>
+        <w:t>การวิเคราะห์และออกแบบระบบ</w:t>
       </w:r>
     </w:p>
     <w:p>
@@ -4675,7 +4799,7 @@
           <w:color w:val="000000"/>
           <w:sz w:val="36"/>
         </w:rPr>
-        <w:t>3.1 ข้อกำหนดความต้องการของระบบ (System Requirements)</w:t>
+        <w:t>3.1 ความต้องการของระบบ</w:t>
       </w:r>
     </w:p>
     <w:p>
@@ -4690,7 +4814,7 @@
           <w:color w:val="000000"/>
           <w:sz w:val="32"/>
         </w:rPr>
-        <w:t>3.1.1 ข้อกำหนดเชิงฟังก์ชัน (Functional Requirements: FR)</w:t>
+        <w:t>3.1.1 ข้อกำหนดเชิงฟังก์ชัน (Functional Requirements)</w:t>
       </w:r>
     </w:p>
     <w:p>
@@ -4720,7 +4844,7 @@
           <w:color w:val="000000"/>
           <w:sz w:val="32"/>
         </w:rPr>
-        <w:t>• FR-02: ผู้ใช้สามารถค้นหา กรอง และจัดเด็คการ์ดตามกฎกติกาอย่างเป็นทางการ พร้อมบันทึกลง DynamoDB</w:t>
+        <w:t>• FR-02: ผู้ใช้สามารถค้นหา กรอง และจัดเด็คการ์ดตามกฎกติกา พร้อมบันทึกลง DynamoDB</w:t>
       </w:r>
     </w:p>
     <w:p>
@@ -4765,7 +4889,7 @@
           <w:color w:val="000000"/>
           <w:sz w:val="32"/>
         </w:rPr>
-        <w:t>• FR-05: ผู้เล่นสามารถสุ่มเปิดซองการ์ด Booster Pack 12 ใบ พร้อมตรวจสอบการ์ด 3D แบบหมุนรอบทิศทาง</w:t>
+        <w:t>• FR-05: ผู้เล่นสามารถสุ่มเปิดซองการ์ด Booster Pack 12 ใบ พร้อมตรวจสอบการ์ดแบบ 3 มิติ</w:t>
       </w:r>
     </w:p>
     <w:p>
@@ -4780,7 +4904,7 @@
           <w:color w:val="000000"/>
           <w:sz w:val="32"/>
         </w:rPr>
-        <w:t>3.1.2 ข้อกำหนดที่ไม่ใช่เชิงฟังก์ชัน (Non-Functional Requirements: NFR)</w:t>
+        <w:t>3.1.2 ข้อกำหนดที่ไม่ใช่เชิงฟังก์ชัน (Non-Functional Requirements)</w:t>
       </w:r>
     </w:p>
     <w:p>
@@ -4795,7 +4919,7 @@
           <w:color w:val="000000"/>
           <w:sz w:val="32"/>
         </w:rPr>
-        <w:t>• NFR-01 (Latency): ความหน่วงในการซิงค์ข้อมูลระหว่างผู้เล่นต้องต่ำกว่า 100 มิลลิวินาที (Sub-100ms)</w:t>
+        <w:t>• NFR-01 (Latency): ความหน่วงในการซิงค์ข้อมูลระหว่างผู้เล่นต้องต่ำกว่า 100 มิลลิวินาที</w:t>
       </w:r>
     </w:p>
     <w:p>
@@ -4810,7 +4934,7 @@
           <w:color w:val="000000"/>
           <w:sz w:val="32"/>
         </w:rPr>
-        <w:t>• NFR-02 (High Availability): ระบบต้องทำงานแบบ Multi-AZ สามารถสลับการทำงานอัตโนมัติหากโซนใดโซนหนึ่งขัดข้อง</w:t>
+        <w:t>• NFR-02 (Availability): ระบบต้องทำงานแบบ Multi-AZ สามารถสลับการทำงานอัตโนมัติหากโซนใดโซนหนึ่งขัดข้อง</w:t>
       </w:r>
     </w:p>
     <w:p>
@@ -4825,7 +4949,7 @@
           <w:color w:val="000000"/>
           <w:sz w:val="32"/>
         </w:rPr>
-        <w:t>• NFR-03 (Scalability): ระบบต้องสามารถเพิ่มจำนวนอินสแตนซ์โดยอัตโนมัติเมื่อ CPU เฉลี่ยเกิน 60%</w:t>
+        <w:t>• NFR-03 (Scalability): ระบบต้องสามารถเพิ่มจำนวนอินสแตนซ์อัตโนมัติเมื่อ CPU เฉลี่ยเกิน 60%</w:t>
       </w:r>
     </w:p>
     <w:p>
@@ -4870,7 +4994,7 @@
           <w:color w:val="000000"/>
           <w:sz w:val="36"/>
         </w:rPr>
-        <w:t>3.2 การออกแบบสถาปัตยกรรมคลาวด์บน AWS (Dual Infrastructure Model)</w:t>
+        <w:t>3.2 สถาปัตยกรรมระบบคลาวด์บน AWS</w:t>
       </w:r>
     </w:p>
     <w:p>
@@ -4886,7 +5010,7 @@
           <w:color w:val="000000"/>
           <w:sz w:val="32"/>
         </w:rPr>
-        <w:t>ระบบได้รับการออกแบบตามสถาปัตยกรรมแบบผสมผสาน (Hybrid Cloud Architecture) ที่มี Primary IaaS Stack ควบคู่กับ Secondary Serverless Fallback Mode ดังแสดงในรูปที่ 3.1:</w:t>
+        <w:t>ระบบได้รับการออกแบบตามสถาปัตยกรรม Hybrid Cloud ที่มี Primary IaaS Stack ควบคู่กับ Secondary Serverless Stack ดังแสดงในรูปที่ 3.1:</w:t>
       </w:r>
     </w:p>
     <w:p>
@@ -4964,7 +5088,7 @@
           <w:color w:val="000000"/>
           <w:sz w:val="36"/>
         </w:rPr>
-        <w:t>3.3 สถาปัตยกรรมเครือข่ายและการควบคุมต้นทุน (Lean Multi-AZ VPC)</w:t>
+        <w:t>3.3 สถาปัตยกรรมเครือข่าย Lean Multi-AZ VPC</w:t>
       </w:r>
     </w:p>
     <w:p>
@@ -5010,7 +5134,7 @@
           <w:color w:val="000000"/>
           <w:sz w:val="32"/>
         </w:rPr>
-        <w:t>• Chained Security Groups (การรักษาความปลอดภัยแบบลูกโซ่ไร้ต้นทุน):</w:t>
+        <w:t>• Chained Security Groups สำหรับควบคุมความปลอดภัย:</w:t>
       </w:r>
     </w:p>
     <w:p>
@@ -5056,7 +5180,7 @@
           <w:color w:val="000000"/>
           <w:sz w:val="32"/>
         </w:rPr>
-        <w:t>สถาปัตยกรรมนี้ช่วยตัดค่าใช้จ่าย NAT Gateway ($32.40/เดือน) เหลือ $0.00 โดยยังคงความปลอดภัยเทียบเท่าการวางเครื่องใน Private Subnet</w:t>
+        <w:t>สถาปัตยกรรมนี้ช่วยตัดค่าใช้จ่าย NAT Gateway ($32.40 ต่อเดือน) เหลือ $0.00 โดยยังคงความปลอดภัยเทียบเท่าการวางเครื่องใน Private Subnet</w:t>
       </w:r>
     </w:p>
     <w:p>
@@ -5071,7 +5195,7 @@
           <w:color w:val="000000"/>
           <w:sz w:val="36"/>
         </w:rPr>
-        <w:t>3.4 การกระจายโหลดและการปรับขนาดอัตโนมัติ (ALB &amp; ASG)</w:t>
+        <w:t>3.4 การกระจายโหลดและการปรับขนาดอัตโนมัติ</w:t>
       </w:r>
     </w:p>
     <w:p>
@@ -5087,7 +5211,7 @@
           <w:color w:val="000000"/>
           <w:sz w:val="32"/>
         </w:rPr>
-        <w:t>Application Load Balancer ทำหน้าที่กระจายโหลดทราฟฟิกลงสู่อินสแตนซ์ EC2 ในแต่ละ AZ ผ่าน Target Group ที่มี Health Check ผ่านเส้นทาง GET /health ทุก 15 วินาที พร้อมเปิดใช้งาน Sticky Sessions (Cookie Stickiness) เพื่อป้องกันการเชื่อมต่อ WebSocket หลุดขณะแข่งขัน</w:t>
+        <w:t>Application Load Balancer ทำหน้าที่กระจายโหลดทราฟฟิกลงสู่อินสแตนซ์ EC2 ในแต่ละ AZ ผ่าน Target Group ที่มี Health Check ผ่านเส้นทาง GET /health ทุก 15 วินาที พร้อมเปิดใช้งาน Sticky Sessions เพื่อป้องกันการเชื่อมต่อ WebSocket หลุดขณะแข่งขัน</w:t>
       </w:r>
     </w:p>
     <w:p>
@@ -5118,7 +5242,7 @@
           <w:color w:val="000000"/>
           <w:sz w:val="36"/>
         </w:rPr>
-        <w:t>3.5 การออกแบบฐานข้อมูลแบบ NoSQL (Amazon DynamoDB Schema)</w:t>
+        <w:t>3.5 การออกแบบฐานข้อมูล Amazon DynamoDB</w:t>
       </w:r>
     </w:p>
     <w:p>
@@ -5149,7 +5273,7 @@
           <w:color w:val="000000"/>
           <w:sz w:val="32"/>
         </w:rPr>
-        <w:t>ตารางที่ 3.1: โครงสร้างตารางข้อมูล Amazon DynamoDB (NoSQL Schema)</w:t>
+        <w:t>ตารางที่ 3.1: โครงสร้างตารางข้อมูล Amazon DynamoDB</w:t>
       </w:r>
     </w:p>
     <w:tbl>
@@ -5684,7 +5808,7 @@
           <w:color w:val="000000"/>
           <w:sz w:val="36"/>
         </w:rPr>
-        <w:t>3.6 ลำดับขั้นตอนการทำงานและการสื่อสารแบบเรียลไทม์ (Match Lifecycle v1.5.0)</w:t>
+        <w:t>3.6 วงจรการสื่อสารแบบเรียลไทม์ (Match Lifecycle)</w:t>
       </w:r>
     </w:p>
     <w:p>
@@ -5699,7 +5823,7 @@
           <w:color w:val="000000"/>
           <w:sz w:val="32"/>
         </w:rPr>
-        <w:t>1. การสร้างและเข้าร่วมห้อง (JOIN_ROOM): ผู้เล่นส่งรหัสห้อง 6 หลัก เซิร์ฟเวอร์บันทึก Connection ลง Memory/DynamoDB และกำหนดบทบาท Player 1 หรือ Player 2</w:t>
+        <w:t>1. การสร้างและเข้าร่วมห้อง (JOIN_ROOM): ผู้เล่นส่งรหัสห้อง 6 หลัก เซิร์ฟเวอร์บันทึก Connection ลง Memory และ DynamoDB พร้อมกำหนดบทบาท Player 1 หรือ Player 2</w:t>
       </w:r>
     </w:p>
     <w:p>
@@ -5714,7 +5838,7 @@
           <w:color w:val="000000"/>
           <w:sz w:val="32"/>
         </w:rPr>
-        <w:t>2. การซิงค์การกระทำ (CARD_MOVED, CARD_EXERTED, LORE_UPDATED): หน้าจอผู้เล่นทำ Optimistic UI Update ทันที (0ms) และส่ง Action Payload ผ่าน WebSocket ไปยังเซิร์ฟเวอร์เพื่อ Relay ข้ามไปยังคู่แข่งภายใน &lt;100ms</w:t>
+        <w:t>2. การซิงค์การกระทำ (Action Sync): หน้าจอผู้เล่นทำ Optimistic UI Update ทันที (0ms) และส่ง Action Payload ผ่าน WebSocket ไปยังเซิร์ฟเวอร์เพื่อ Relay ข้ามไปยังคู่แข่งภายในเวลาต่ำกว่า 100 มิลลิวินาที</w:t>
       </w:r>
     </w:p>
     <w:p>
@@ -5759,7 +5883,7 @@
           <w:color w:val="000000"/>
           <w:sz w:val="36"/>
         </w:rPr>
-        <w:t>3.7 การรับมือกับความล้มเหลวของบริการภายนอก (Resilience &amp; Caching)</w:t>
+        <w:t>3.7 การรับมือข้อผิดพลาดและระบบ Caching</w:t>
       </w:r>
     </w:p>
     <w:p>
@@ -5775,7 +5899,7 @@
           <w:color w:val="000000"/>
           <w:sz w:val="32"/>
         </w:rPr>
-        <w:t>ระบบใช้กลยุทธ์ Multi-Tier Resilience เพื่อป้องกันระบบหยุดชะงักหาก Lorcast API ล่ม:</w:t>
+        <w:t>ระบบใช้กลยุทธ์ Multi-Tier Resilience เพื่อป้องกันระบบหยุดชะงักหาก Lorcast API เกิดปัญหา:</w:t>
       </w:r>
     </w:p>
     <w:p>
@@ -5890,7 +6014,7 @@
           <w:color w:val="000000"/>
           <w:sz w:val="36"/>
         </w:rPr>
-        <w:t>3.8 การปฏิบัติตามกรอบ AWS Well-Architected Framework 5 เสาหลัก</w:t>
+        <w:t>3.8 การออกแบบตามกรอบ AWS Well-Architected Framework</w:t>
       </w:r>
     </w:p>
     <w:p>
@@ -5905,7 +6029,7 @@
           <w:color w:val="000000"/>
           <w:sz w:val="32"/>
         </w:rPr>
-        <w:t>• Reliability (ความเชื่อถือได้): สถาปัตยกรรมข้าม 2 Availability Zones พร้อม Health Checks และ Sticky Sessions</w:t>
+        <w:t>• Reliability: ออกแบบสถาปัตยกรรมข้าม 2 Availability Zones พร้อม Health Checks และ Sticky Sessions</w:t>
       </w:r>
     </w:p>
     <w:p>
@@ -5920,7 +6044,7 @@
           <w:color w:val="000000"/>
           <w:sz w:val="32"/>
         </w:rPr>
-        <w:t>• Performance Efficiency (ประสิทธิภาพ): ใช้ Alpine Container, In-memory Caching, และ WebSockets ที่ลด Overhead ของ HTTP Polling ได้กว่า 85%</w:t>
+        <w:t>• Performance Efficiency: ใช้ Alpine Container, In-memory Caching และ WebSockets ซึ่งลด Overhead ของ HTTP Polling ได้กว่า 85%</w:t>
       </w:r>
     </w:p>
     <w:p>
@@ -5935,7 +6059,7 @@
           <w:color w:val="000000"/>
           <w:sz w:val="32"/>
         </w:rPr>
-        <w:t>• Security (ความปลอดภัย): ใช้ IMDSv2 ป้องกัน SSRF, Chained Security Groups, แฮชรหัสผ่านด้วย bcrypt และไม่ฝัง Credential ใน Source Code</w:t>
+        <w:t>• Security: ใช้ IMDSv2 ป้องกัน SSRF, Chained Security Groups, แฮชรหัสผ่านด้วย bcrypt และไม่ฝัง Credential ใน Source Code</w:t>
       </w:r>
     </w:p>
     <w:p>
@@ -5950,7 +6074,7 @@
           <w:color w:val="000000"/>
           <w:sz w:val="32"/>
         </w:rPr>
-        <w:t>• Cost Optimization (การควบคุมต้นทุน): สถาปัตยกรรมไร้ NAT Gateway, ใช้ t3.micro ใน Free Tier และสคริปต์ 1-Click Scale-to-Zero</w:t>
+        <w:t>• Cost Optimization: สถาปัตยกรรมไร้ NAT Gateway, ใช้ EC2 t3.micro ใน Free Tier และสคริปต์ 1-Click Scale-to-Zero</w:t>
       </w:r>
     </w:p>
     <w:p>
@@ -5965,7 +6089,7 @@
           <w:color w:val="000000"/>
           <w:sz w:val="32"/>
         </w:rPr>
-        <w:t>• Operational Excellence (ความเป็นเลิศในการดำเนินงาน): ควบคุมระบบด้วย PowerShell Automation Suite และจัดทำโครงสร้าง IaC พร้อมสคริปต์ทดสอบ</w:t>
+        <w:t>• Operational Excellence: ควบคุมระบบด้วย PowerShell Automation Suite และจัดทำโครงสร้าง IaC พร้อมสคริปต์ทดสอบ</w:t>
       </w:r>
     </w:p>
     <w:p>
@@ -5980,7 +6104,7 @@
           <w:color w:val="000000"/>
           <w:sz w:val="36"/>
         </w:rPr>
-        <w:t>3.9 การแก้ปัญหาข้อจำกัดทางวิศวกรรมบนสภาพแวดล้อม AWS Learner Lab</w:t>
+        <w:t>3.9 การแก้ปัญหาข้อจำกัดบน AWS Learner Lab</w:t>
       </w:r>
     </w:p>
     <w:p>
@@ -6011,7 +6135,7 @@
           <w:color w:val="000000"/>
           <w:sz w:val="32"/>
         </w:rPr>
-        <w:t>ตารางที่ 3.2: ตารางสรุปข้อจำกัดบน AWS Learner Lab และแนวทางแก้ไขเชิงสถาปัตยกรรม</w:t>
+        <w:t>ตารางที่ 3.2: ตารางสรุปข้อจำกัดบน AWS Learner Lab และแนวทางแก้ไข</w:t>
       </w:r>
     </w:p>
     <w:tbl>
@@ -6083,7 +6207,7 @@
                 <w:b/>
                 <w:sz w:val="28"/>
               </w:rPr>
-              <w:t>ข้อจำกัด / ปัญหาทางวิศวกรรม</w:t>
+              <w:t>ข้อจำกัดบน Learner Lab</w:t>
             </w:r>
           </w:p>
         </w:tc>
@@ -6135,7 +6259,7 @@
                 <w:b/>
                 <w:sz w:val="28"/>
               </w:rPr>
-              <w:t>แนวทางแก้ไขเชิงสถาปัตยกรรม (Solution)</w:t>
+              <w:t>แนวทางแก้ไขเชิงสถาปัตยกรรม</w:t>
             </w:r>
           </w:p>
         </w:tc>
@@ -6209,7 +6333,7 @@
                 <w:rFonts w:ascii="TH Sarabun New" w:hAnsi="TH Sarabun New"/>
                 <w:sz w:val="28"/>
               </w:rPr>
-              <w:t>ไม่สามารถสร้าง IAM Role ใหม่สำหรับ EC2/Lambda ได้</w:t>
+              <w:t>ไม่สามารถสร้าง IAM Role ใหม่สำหรับ EC2 หรือ Lambda ได้</w:t>
             </w:r>
           </w:p>
         </w:tc>
@@ -6429,7 +6553,7 @@
                 <w:rFonts w:ascii="TH Sarabun New" w:hAnsi="TH Sarabun New"/>
                 <w:sz w:val="28"/>
               </w:rPr>
-              <w:t>พัฒนาสคริปต์ 1-Click Scale-to-Zero (lab_stop.ps1) ยุบเครื่อง EC2 เหลือ 0 เมื่อเลิกแล็ป ($0.00/ชม.)</w:t>
+              <w:t>พัฒนาสคริปต์ 1-Click Scale-to-Zero ยุบเครื่อง EC2 เหลือ 0 เมื่อเลิกแล็ป ($0.00 ต่อชั่วโมง)</w:t>
             </w:r>
           </w:p>
         </w:tc>
@@ -6663,7 +6787,7 @@
           <w:color w:val="000000"/>
           <w:sz w:val="40"/>
         </w:rPr>
-        <w:t>การพัฒนาระบบและผลการดำเนินงาน (Implementation &amp; Test Results)</w:t>
+        <w:t>การพัฒนาระบบและผลการดำเนินงาน</w:t>
       </w:r>
     </w:p>
     <w:p>
@@ -6678,7 +6802,7 @@
           <w:color w:val="000000"/>
           <w:sz w:val="36"/>
         </w:rPr>
-        <w:t>4.1 การพัฒนาส่วนติดต่อผู้ใช้ (Frontend Implementation &amp; Playmat UI)</w:t>
+        <w:t>4.1 การพัฒนาส่วนติดต่อผู้ใช้และ Playmat</w:t>
       </w:r>
     </w:p>
     <w:p>
@@ -6804,7 +6928,7 @@
           <w:color w:val="000000"/>
           <w:sz w:val="32"/>
         </w:rPr>
-        <w:t>รูปที่ 4.2: กระดานจำลองการเล่นการ์ดแบบเรียลไทม์ (Interactive Playmat Tabletop)</w:t>
+        <w:t>รูปที่ 4.2: กระดานจำลองการเล่นการ์ดแบบเรียลไทม์ Interactive Playmat</w:t>
       </w:r>
     </w:p>
     <w:p>
@@ -6859,7 +6983,7 @@
           <w:color w:val="000000"/>
           <w:sz w:val="32"/>
         </w:rPr>
-        <w:t>รูปที่ 4.3: ระบบจำลองการสุ่มเปิดซองการ์ดแบบ 3 มิติ (3D Booster Pack Opening)</w:t>
+        <w:t>รูปที่ 4.3: ระบบจำลองการสุ่มเปิดซองการ์ด 3D Booster Pack Opening</w:t>
       </w:r>
     </w:p>
     <w:p>
@@ -6890,7 +7014,7 @@
           <w:color w:val="000000"/>
           <w:sz w:val="32"/>
         </w:rPr>
-        <w:t>• Play Area (Battlefield): พื้นที่ลงการ์ดตัวละคร ไอเทม และสถานที่ รองรับการลากวาง การแตะเพื่อสั่ง Ready/Exert และการโจมตี</w:t>
+        <w:t>• Play Area: พื้นที่ลงการ์ดตัวละคร ไอเทม และสถานที่ รองรับการลากวาง การแตะเพื่อสั่ง Ready/Exert และการโจมตี</w:t>
       </w:r>
     </w:p>
     <w:p>
@@ -6965,7 +7089,7 @@
           <w:color w:val="000000"/>
           <w:sz w:val="36"/>
         </w:rPr>
-        <w:t>4.2 การพัฒนาส่วนประมวลผลและการบรรจุคอนเทนเนอร์ (Compute &amp; Docker)</w:t>
+        <w:t>4.2 การพัฒนา Backend และ Docker Container</w:t>
       </w:r>
     </w:p>
     <w:p>
@@ -6996,7 +7120,7 @@
           <w:color w:val="000000"/>
           <w:sz w:val="32"/>
         </w:rPr>
-        <w:t>1. Multi-stage Docker Build: Stage 1 (Builder) รัน Node.js 20 Alpine ติดตั้ง Dependencies และ Build Vite SPA, Stage 2 (Runner) คัดลอกเฉพาะ Dist Output และ Production Dependencies ทำให้ขนาดอิมเมจสุดท้ายต่ำกว่า 90 MB</w:t>
+        <w:t>1. Multi-stage Docker Build: Stage 1 รัน Node.js 20 Alpine ติดตั้ง Dependencies และ Build Vite SPA, Stage 2 คัดลอกเฉพาะ Dist Output และ Production Dependencies ทำให้ขนาดอิมเมจสุดท้ายต่ำกว่า 90 MB</w:t>
       </w:r>
     </w:p>
     <w:p>
@@ -7026,7 +7150,7 @@
           <w:color w:val="000000"/>
           <w:sz w:val="32"/>
         </w:rPr>
-        <w:t>3. Unified Server (backend/server.ts): รวมการประมวลผล REST API (Auth &amp; Decks) และ WebSocket Match Server ไว้ในโค้ดเบสเดียวกัน ใช้หน่วยความจำต่ำกว่า 150 MB ทำให้รันบนเครื่อง EC2 t3.micro ได้อย่างราบรื่น</w:t>
+        <w:t>3. Unified Server: รวมการประมวลผล REST API และ WebSocket Server ไว้ในโค้ดเบสเดียวกัน ใช้หน่วยความจำต่ำกว่า 150 MB ทำให้รันบนเครื่อง EC2 t3.micro ได้อย่างราบรื่น</w:t>
       </w:r>
     </w:p>
     <w:p>
@@ -7041,7 +7165,7 @@
           <w:color w:val="000000"/>
           <w:sz w:val="36"/>
         </w:rPr>
-        <w:t>4.3 ผลการทดสอบระบบและหลักฐานเชิงประจักษ์ (Empirical Test Results)</w:t>
+        <w:t>4.3 ผลการทดสอบระบบ</w:t>
       </w:r>
     </w:p>
     <w:p>
@@ -8965,7 +9089,7 @@
           <w:color w:val="000000"/>
           <w:sz w:val="32"/>
         </w:rPr>
-        <w:t>• Unit &amp; Store Integration Tests (Vitest 4.x): ผ่านครบ 33 / 33 การทดสอบ (100% Success Rate)</w:t>
+        <w:t>• Unit &amp; Store Integration Tests บน Vitest 4.x: ผ่านครบ 33 / 33 การทดสอบ (100% Success Rate)</w:t>
       </w:r>
     </w:p>
     <w:p>
@@ -8980,7 +9104,7 @@
           <w:color w:val="000000"/>
           <w:sz w:val="32"/>
         </w:rPr>
-        <w:t>• End-to-End Browser Tests (Playwright): ผ่าน 49 / 50 การทดสอบ (98%) บน Chromium, Firefox, WebKit</w:t>
+        <w:t>• End-to-End Browser Tests บน Playwright: ผ่าน 49 / 50 การทดสอบ (98%) บน Chromium, Firefox, WebKit</w:t>
       </w:r>
     </w:p>
     <w:p>
@@ -8995,7 +9119,7 @@
           <w:color w:val="000000"/>
           <w:sz w:val="32"/>
         </w:rPr>
-        <w:t>• Load Stress Test บน ALB จริง (scripts/stress_test.ps1): ยิงโหลด 2,000 Requests อัตราความสำเร็จ 100% Response Time เฉลี่ย 42 มิลลิวินาที ไม่พบข้อผิดพลาด HTTP 5xx แม้แต่ครั้งเดียว</w:t>
+        <w:t>• Load Stress Test บน ALB จริง: ยิงโหลด 2,000 Requests อัตราความสำเร็จ 100% Response Time เฉลี่ย 42 มิลลิวินาที ไม่พบข้อผิดพลาด HTTP 5xx แม้แต่ครั้งเดียว</w:t>
       </w:r>
     </w:p>
     <w:p>
@@ -9030,7 +9154,7 @@
           <w:color w:val="000000"/>
           <w:sz w:val="40"/>
         </w:rPr>
-        <w:t>การประเมินค่าใช้จ่ายบนคลาวด์และแผนงานขั้นต่อไป (Cost Assessment &amp; Future Roadmap)</w:t>
+        <w:t>การประเมินค่าใช้จ่ายและแผนงานในอนาคต</w:t>
       </w:r>
     </w:p>
     <w:p>
@@ -9045,7 +9169,7 @@
           <w:color w:val="000000"/>
           <w:sz w:val="36"/>
         </w:rPr>
-        <w:t>5.1 การประเมินค่าใช้จ่ายสถาปัตยกรรมคลาวด์ ($50 Budget Protection)</w:t>
+        <w:t>5.1 การประเมินค่าใช้จ่ายและการควบคุมงบประมาณ</w:t>
       </w:r>
     </w:p>
     <w:p>
@@ -9471,7 +9595,7 @@
                 <w:rFonts w:ascii="TH Sarabun New" w:hAnsi="TH Sarabun New"/>
                 <w:sz w:val="28"/>
               </w:rPr>
-              <w:t>ใช้ Scale-to-Zero (lab_stop.ps1) เปิดเฉพาะตอนเดโม</w:t>
+              <w:t>ใช้ Scale-to-Zero เปิดเฉพาะตอนเดโม</w:t>
             </w:r>
           </w:p>
         </w:tc>
@@ -9987,7 +10111,7 @@
           <w:color w:val="000000"/>
           <w:sz w:val="36"/>
         </w:rPr>
-        <w:t>5.2 แผนงานการพัฒนาสำหรับ Stage 3 (Sprint 4 ถึง Sprint 7)</w:t>
+        <w:t>5.2 แผนการพัฒนาสำหรับ Stage 3</w:t>
       </w:r>
     </w:p>
     <w:p>
@@ -10017,7 +10141,7 @@
           <w:color w:val="000000"/>
           <w:sz w:val="32"/>
         </w:rPr>
-        <w:t>2. Sprint 5 (26 ก.ย. – 10 ต.ค.): Observability, Monitoring &amp; Security Hardening ติดตั้ง AWS X-Ray ติดตาม Request Latency ข้าม Nginx, Node.js, และ DynamoDB พร้อมสร้าง CloudWatch Dashboard รวมสถิติ ALB</w:t>
+        <w:t>2. Sprint 5 (26 ก.ย. – 10 ต.ค.): Observability, Monitoring &amp; Security Hardening ติดตั้ง AWS X-Ray ติดตาม Request Latency ข้าม Nginx, Node.js และ DynamoDB พร้อมสร้าง CloudWatch Dashboard รวมสถิติ ALB</w:t>
       </w:r>
     </w:p>
     <w:p>
@@ -10062,7 +10186,7 @@
           <w:color w:val="000000"/>
           <w:sz w:val="36"/>
         </w:rPr>
-        <w:t>5.3 สรุปผลการดำเนินงานและบทเรียนที่ได้รับ (Sprint Retrospective)</w:t>
+        <w:t>5.3 สรุปผลการดำเนินงานและบทเรียนที่ได้รับ</w:t>
       </w:r>
     </w:p>
     <w:p>
@@ -10078,7 +10202,7 @@
           <w:color w:val="000000"/>
           <w:sz w:val="32"/>
         </w:rPr>
-        <w:t>การดำเนินงานโครงงาน Disney Lorcana PlayLab Cloud ใน Sprint 1 ถึง 3 บรรลุตามวัตถุประสงค์ของการส่งมอบงาน Stage 2 ได้อย่างสมบูรณ์ บทเรียนทางวิศวกรรมที่สำคัญประกอบด้วย:</w:t>
+        <w:t>การดำเนินงานโครงงาน Disney Lorcana PlayLab Cloud ใน Sprint 1 ถึง 3 บรรลุตามวัตถุประสงค์ของการส่งมอบงาน Stage 2 ครบถ้วน บทเรียนทางวิศวกรรมที่สำคัญประกอบด้วย:</w:t>
       </w:r>
     </w:p>
     <w:p>
@@ -10093,7 +10217,7 @@
           <w:color w:val="000000"/>
           <w:sz w:val="32"/>
         </w:rPr>
-        <w:t>1. การออกแบบเพื่อควบคุมต้นทุน (Cost-Aware Engineering): การเข้าใจการทำงานของ Chained Security Groups ทำให้สามารถสร้างสถาปัตยกรรมที่ปลอดภัยระดับ Production โดยไม่ต้องสิ้นเปลืองงบประมาณกับ NAT Gateway</w:t>
+        <w:t>1. การออกแบบเพื่อควบคุมต้นทุน: การเข้าใจการทำงานของ Chained Security Groups ทำให้สามารถสร้างสถาปัตยกรรมที่ปลอดภัยระดับ Production โดยไม่ต้องสิ้นเปลืองงบประมาณกับ NAT Gateway</w:t>
       </w:r>
     </w:p>
     <w:p>
@@ -10108,7 +10232,7 @@
           <w:color w:val="000000"/>
           <w:sz w:val="32"/>
         </w:rPr>
-        <w:t>2. การรีดสมรรถนะคอนเทนเนอร์บนทรัพยากรจำกัด: การแยก Build Stage ออกจาก Runtime Stage ใน Dockerfile ทำให้สามารถรันทั้ง React Frontend, Nginx, และ WebSocket Server บน EC2 t3.micro (RAM 1GB) ได้อย่างมีเสถียรภาพ</w:t>
+        <w:t>2. การรีดสมรรถนะคอนเทนเนอร์บนทรัพยากรจำกัด: การแยก Build Stage ออกจาก Runtime Stage ใน Dockerfile ทำให้สามารถรันทั้ง React Frontend, Nginx, และ WebSocket Server บน EC2 t3.micro ได้อย่างมีเสถียรภาพ</w:t>
       </w:r>
     </w:p>
     <w:p>
@@ -10123,7 +10247,7 @@
           <w:color w:val="000000"/>
           <w:sz w:val="32"/>
         </w:rPr>
-        <w:t>3. การจัดการสถานะระบบกระจาย (Distributed State Management): การผสานระหว่าง Optimistic UI Update บนเบราว์เซอร์, In-memory WebSocket Relay, และ NoSQL State Persistence ใน DynamoDB ช่วยลดความหน่วงในมุมมองของผู้เล่นลงเหลือศูนย์ พร้อมรับประกันความคงอยู่ของข้อมูลเมื่อเกิดปัญหาเครือข่าย</w:t>
+        <w:t>3. การจัดการสถานะระบบกระจาย: การผสานระหว่าง Optimistic UI Update บนเบราว์เซอร์, In-memory WebSocket Relay, และ NoSQL State Persistence ใน DynamoDB ช่วยลดความหน่วงในมุมมองของผู้เล่นลงเหลือศูนย์ พร้อมรับประกันความคงอยู่ของข้อมูลเมื่อเกิดปัญหาเครือข่าย</w:t>
       </w:r>
     </w:p>
     <w:p>
@@ -10143,7 +10267,7 @@
           <w:color w:val="000000"/>
           <w:sz w:val="40"/>
         </w:rPr>
-        <w:t>บรรณานุกรม (References)</w:t>
+        <w:t>บรรณานุกรม</w:t>
       </w:r>
     </w:p>
     <w:p>
@@ -10303,7 +10427,7 @@
           <w:color w:val="000000"/>
           <w:sz w:val="40"/>
         </w:rPr>
-        <w:t>ภาคผนวก (Appendix)</w:t>
+        <w:t>ภาคผนวก</w:t>
       </w:r>
     </w:p>
     <w:p>
@@ -10318,7 +10442,7 @@
           <w:color w:val="000000"/>
           <w:sz w:val="36"/>
         </w:rPr>
-        <w:t>ภาคผนวก ก: สคริปต์ปรับใช้ระบบ Lean Multi-AZ VPC, ALB และ ASG (scripts/deploy_ec2_vpc_asg.ps1)</w:t>
+        <w:t>ภาคผนวก ก: สคริปต์ปรับใช้ระบบ Lean Multi-AZ VPC, ALB และ ASG</w:t>
       </w:r>
     </w:p>
     <w:p>
@@ -10411,7 +10535,7 @@
           <w:color w:val="000000"/>
           <w:sz w:val="36"/>
         </w:rPr>
-        <w:t>ภาคผนวก ข: สคริปต์ 1-Click Scale-to-Zero ควบคุมงบประมาณ (scripts/lab_stop.ps1)</w:t>
+        <w:t>ภาคผนวก ข: สคริปต์ 1-Click Scale-to-Zero สำหรับควบคุมงบประมาณ</w:t>
       </w:r>
     </w:p>
     <w:p>

</xml_diff>